<commit_message>
To Set Table Border Color and Odd and Even Color for Table Body
</commit_message>
<xml_diff>
--- a/claimed-raised/claimed_closed.docx
+++ b/claimed-raised/claimed_closed.docx
@@ -5,7 +5,39 @@
     <w:p/>
     <w:p>
       <w:r>
-        <w:t>SELECT * FROM itm.tbl_device_clamin_history where reference_no_claim = 14533 AND EXTRACT(YEAR FROM create_at) = 2026;</w:t>
+        <w:t xml:space="preserve">SELECT * FROM </w:t>
+      </w:r>
+      <w:proofErr w:type="spellStart"/>
+      <w:r>
+        <w:t>itm.tbl_device_clamin_history</w:t>
+      </w:r>
+      <w:proofErr w:type="spellEnd"/>
+      <w:r>
+        <w:t xml:space="preserve"> where </w:t>
+      </w:r>
+      <w:proofErr w:type="spellStart"/>
+      <w:r>
+        <w:t>reference_no_claim</w:t>
+      </w:r>
+      <w:proofErr w:type="spellEnd"/>
+      <w:r>
+        <w:t xml:space="preserve"> = 14533 AND </w:t>
+      </w:r>
+      <w:proofErr w:type="gramStart"/>
+      <w:r>
+        <w:t>EXTRACT(</w:t>
+      </w:r>
+      <w:proofErr w:type="gramEnd"/>
+      <w:r>
+        <w:t xml:space="preserve">YEAR FROM </w:t>
+      </w:r>
+      <w:proofErr w:type="spellStart"/>
+      <w:r>
+        <w:t>create_at</w:t>
+      </w:r>
+      <w:proofErr w:type="spellEnd"/>
+      <w:r>
+        <w:t>) = 2026;</w:t>
       </w:r>
     </w:p>
     <w:p>
@@ -102,17 +134,54 @@
     </w:p>
     <w:p>
       <w:r>
-        <w:t>FROM itm.tbl_device_claim</w:t>
-      </w:r>
-    </w:p>
-    <w:p>
-      <w:r>
-        <w:t>WHERE claim_status = 10 and reference_no_claim= '14533'</w:t>
-      </w:r>
-    </w:p>
-    <w:p>
-      <w:r>
-        <w:t xml:space="preserve">  AND EXTRACT(YEAR FROM created_at) = 2026;</w:t>
+        <w:t xml:space="preserve">FROM </w:t>
+      </w:r>
+      <w:proofErr w:type="spellStart"/>
+      <w:r>
+        <w:t>itm.tbl_device_claim</w:t>
+      </w:r>
+      <w:proofErr w:type="spellEnd"/>
+    </w:p>
+    <w:p>
+      <w:r>
+        <w:t xml:space="preserve">WHERE </w:t>
+      </w:r>
+      <w:proofErr w:type="spellStart"/>
+      <w:r>
+        <w:t>claim_status</w:t>
+      </w:r>
+      <w:proofErr w:type="spellEnd"/>
+      <w:r>
+        <w:t xml:space="preserve"> = 10 and </w:t>
+      </w:r>
+      <w:proofErr w:type="spellStart"/>
+      <w:r>
+        <w:t>reference_no_claim</w:t>
+      </w:r>
+      <w:proofErr w:type="spellEnd"/>
+      <w:r>
+        <w:t>= '14533'</w:t>
+      </w:r>
+    </w:p>
+    <w:p>
+      <w:r>
+        <w:t xml:space="preserve">  AND </w:t>
+      </w:r>
+      <w:proofErr w:type="gramStart"/>
+      <w:r>
+        <w:t>EXTRACT(</w:t>
+      </w:r>
+      <w:proofErr w:type="gramEnd"/>
+      <w:r>
+        <w:t xml:space="preserve">YEAR FROM </w:t>
+      </w:r>
+      <w:proofErr w:type="spellStart"/>
+      <w:r>
+        <w:t>created_at</w:t>
+      </w:r>
+      <w:proofErr w:type="spellEnd"/>
+      <w:r>
+        <w:t>) = 2026;</w:t>
       </w:r>
     </w:p>
     <w:p/>
@@ -177,8 +246,13 @@
     </w:p>
     <w:p/>
     <w:p>
-      <w:r>
-        <w:t>Reference : 14533</w:t>
+      <w:proofErr w:type="gramStart"/>
+      <w:r>
+        <w:t>Reference :</w:t>
+      </w:r>
+      <w:proofErr w:type="gramEnd"/>
+      <w:r>
+        <w:t xml:space="preserve"> 14533</w:t>
       </w:r>
     </w:p>
     <w:p/>
@@ -190,37 +264,108 @@
     </w:p>
     <w:p>
       <w:r>
-        <w:t xml:space="preserve">    reference_no_claim,</w:t>
-      </w:r>
-    </w:p>
-    <w:p>
-      <w:r>
-        <w:t xml:space="preserve">    MAX(create_at) AS closing_date</w:t>
-      </w:r>
-    </w:p>
-    <w:p>
-      <w:r>
-        <w:t>FROM itm.tbl_device_clamin_history</w:t>
-      </w:r>
-    </w:p>
-    <w:p>
-      <w:r>
-        <w:t>WHERE reference_no_claim = 14533</w:t>
-      </w:r>
-    </w:p>
-    <w:p>
-      <w:r>
-        <w:t xml:space="preserve">  AND current_status = 10</w:t>
-      </w:r>
-    </w:p>
-    <w:p>
-      <w:r>
-        <w:t xml:space="preserve">  AND EXTRACT(YEAR FROM create_at) = 2026</w:t>
-      </w:r>
-    </w:p>
-    <w:p>
-      <w:r>
-        <w:t>GROUP BY reference_no_claim;</w:t>
+        <w:t xml:space="preserve">    </w:t>
+      </w:r>
+      <w:proofErr w:type="spellStart"/>
+      <w:r>
+        <w:t>reference_no_claim</w:t>
+      </w:r>
+      <w:proofErr w:type="spellEnd"/>
+      <w:r>
+        <w:t>,</w:t>
+      </w:r>
+    </w:p>
+    <w:p>
+      <w:r>
+        <w:t xml:space="preserve">    </w:t>
+      </w:r>
+      <w:proofErr w:type="gramStart"/>
+      <w:r>
+        <w:t>MAX(</w:t>
+      </w:r>
+      <w:proofErr w:type="spellStart"/>
+      <w:proofErr w:type="gramEnd"/>
+      <w:r>
+        <w:t>create_at</w:t>
+      </w:r>
+      <w:proofErr w:type="spellEnd"/>
+      <w:r>
+        <w:t xml:space="preserve">) AS </w:t>
+      </w:r>
+      <w:proofErr w:type="spellStart"/>
+      <w:r>
+        <w:t>closing_date</w:t>
+      </w:r>
+      <w:proofErr w:type="spellEnd"/>
+    </w:p>
+    <w:p>
+      <w:r>
+        <w:t xml:space="preserve">FROM </w:t>
+      </w:r>
+      <w:proofErr w:type="spellStart"/>
+      <w:r>
+        <w:t>itm.tbl_device_clamin_history</w:t>
+      </w:r>
+      <w:proofErr w:type="spellEnd"/>
+    </w:p>
+    <w:p>
+      <w:r>
+        <w:t xml:space="preserve">WHERE </w:t>
+      </w:r>
+      <w:proofErr w:type="spellStart"/>
+      <w:r>
+        <w:t>reference_no_claim</w:t>
+      </w:r>
+      <w:proofErr w:type="spellEnd"/>
+      <w:r>
+        <w:t xml:space="preserve"> = 14533</w:t>
+      </w:r>
+    </w:p>
+    <w:p>
+      <w:r>
+        <w:t xml:space="preserve">  AND </w:t>
+      </w:r>
+      <w:proofErr w:type="spellStart"/>
+      <w:r>
+        <w:t>current_status</w:t>
+      </w:r>
+      <w:proofErr w:type="spellEnd"/>
+      <w:r>
+        <w:t xml:space="preserve"> = 10</w:t>
+      </w:r>
+    </w:p>
+    <w:p>
+      <w:r>
+        <w:t xml:space="preserve">  AND </w:t>
+      </w:r>
+      <w:proofErr w:type="gramStart"/>
+      <w:r>
+        <w:t>EXTRACT(</w:t>
+      </w:r>
+      <w:proofErr w:type="gramEnd"/>
+      <w:r>
+        <w:t xml:space="preserve">YEAR FROM </w:t>
+      </w:r>
+      <w:proofErr w:type="spellStart"/>
+      <w:r>
+        <w:t>create_at</w:t>
+      </w:r>
+      <w:proofErr w:type="spellEnd"/>
+      <w:r>
+        <w:t>) = 2026</w:t>
+      </w:r>
+    </w:p>
+    <w:p>
+      <w:r>
+        <w:t xml:space="preserve">GROUP BY </w:t>
+      </w:r>
+      <w:proofErr w:type="spellStart"/>
+      <w:r>
+        <w:t>reference_no_claim</w:t>
+      </w:r>
+      <w:proofErr w:type="spellEnd"/>
+      <w:r>
+        <w:t>;</w:t>
       </w:r>
     </w:p>
     <w:p/>
@@ -277,32 +422,111 @@
     </w:p>
     <w:p>
       <w:r>
-        <w:t xml:space="preserve">    reference_no_claim,</w:t>
-      </w:r>
-    </w:p>
-    <w:p>
-      <w:r>
-        <w:t xml:space="preserve">    MAX(create_at) AS closing_date</w:t>
-      </w:r>
-    </w:p>
-    <w:p>
-      <w:r>
-        <w:t>FROM itm.tbl_device_clamin_history</w:t>
-      </w:r>
-    </w:p>
-    <w:p>
-      <w:r>
-        <w:t>WHERE current_status = 10 and tbl_device_clamin_history.reference_no_claim = 14533</w:t>
-      </w:r>
-    </w:p>
-    <w:p>
-      <w:r>
-        <w:t xml:space="preserve">  AND EXTRACT(YEAR FROM create_at) = 2026</w:t>
-      </w:r>
-    </w:p>
-    <w:p>
-      <w:r>
-        <w:t>GROUP BY reference_no_claim;</w:t>
+        <w:t xml:space="preserve">    </w:t>
+      </w:r>
+      <w:proofErr w:type="spellStart"/>
+      <w:r>
+        <w:t>reference_no_claim</w:t>
+      </w:r>
+      <w:proofErr w:type="spellEnd"/>
+      <w:r>
+        <w:t>,</w:t>
+      </w:r>
+    </w:p>
+    <w:p>
+      <w:r>
+        <w:t xml:space="preserve">    </w:t>
+      </w:r>
+      <w:proofErr w:type="gramStart"/>
+      <w:r>
+        <w:t>MAX(</w:t>
+      </w:r>
+      <w:proofErr w:type="spellStart"/>
+      <w:proofErr w:type="gramEnd"/>
+      <w:r>
+        <w:t>create_at</w:t>
+      </w:r>
+      <w:proofErr w:type="spellEnd"/>
+      <w:r>
+        <w:t xml:space="preserve">) AS </w:t>
+      </w:r>
+      <w:proofErr w:type="spellStart"/>
+      <w:r>
+        <w:t>closing_date</w:t>
+      </w:r>
+      <w:proofErr w:type="spellEnd"/>
+    </w:p>
+    <w:p>
+      <w:r>
+        <w:t xml:space="preserve">FROM </w:t>
+      </w:r>
+      <w:proofErr w:type="spellStart"/>
+      <w:r>
+        <w:t>itm.tbl_device_clamin_history</w:t>
+      </w:r>
+      <w:proofErr w:type="spellEnd"/>
+    </w:p>
+    <w:p>
+      <w:r>
+        <w:t xml:space="preserve">WHERE </w:t>
+      </w:r>
+      <w:proofErr w:type="spellStart"/>
+      <w:r>
+        <w:t>current_status</w:t>
+      </w:r>
+      <w:proofErr w:type="spellEnd"/>
+      <w:r>
+        <w:t xml:space="preserve"> = 10 and </w:t>
+      </w:r>
+      <w:proofErr w:type="spellStart"/>
+      <w:r>
+        <w:t>tbl_device_clamin_</w:t>
+      </w:r>
+      <w:proofErr w:type="gramStart"/>
+      <w:r>
+        <w:t>history.reference</w:t>
+      </w:r>
+      <w:proofErr w:type="gramEnd"/>
+      <w:r>
+        <w:t>_no_claim</w:t>
+      </w:r>
+      <w:proofErr w:type="spellEnd"/>
+      <w:r>
+        <w:t xml:space="preserve"> = 14533</w:t>
+      </w:r>
+    </w:p>
+    <w:p>
+      <w:r>
+        <w:t xml:space="preserve">  AND </w:t>
+      </w:r>
+      <w:proofErr w:type="gramStart"/>
+      <w:r>
+        <w:t>EXTRACT(</w:t>
+      </w:r>
+      <w:proofErr w:type="gramEnd"/>
+      <w:r>
+        <w:t xml:space="preserve">YEAR FROM </w:t>
+      </w:r>
+      <w:proofErr w:type="spellStart"/>
+      <w:r>
+        <w:t>create_at</w:t>
+      </w:r>
+      <w:proofErr w:type="spellEnd"/>
+      <w:r>
+        <w:t>) = 2026</w:t>
+      </w:r>
+    </w:p>
+    <w:p>
+      <w:r>
+        <w:t xml:space="preserve">GROUP BY </w:t>
+      </w:r>
+      <w:proofErr w:type="spellStart"/>
+      <w:r>
+        <w:t>reference_no_claim</w:t>
+      </w:r>
+      <w:proofErr w:type="spellEnd"/>
+      <w:r>
+        <w:t>;</w:t>
       </w:r>
     </w:p>
     <w:p/>
@@ -364,42 +588,167 @@
     </w:p>
     <w:p>
       <w:r>
-        <w:t xml:space="preserve">    h.claim_reference_no,</w:t>
-      </w:r>
-    </w:p>
-    <w:p>
-      <w:r>
-        <w:t xml:space="preserve">    MAX(h.created_at) AS closing_date</w:t>
-      </w:r>
-    </w:p>
-    <w:p>
-      <w:r>
-        <w:t>FROM public.device_claim_histories h</w:t>
-      </w:r>
-    </w:p>
-    <w:p>
-      <w:r>
-        <w:t>WHERE h.claim_reference_no = '14533'</w:t>
-      </w:r>
-    </w:p>
-    <w:p>
-      <w:r>
-        <w:t xml:space="preserve">  AND h.current_status = 10</w:t>
-      </w:r>
-    </w:p>
-    <w:p>
-      <w:r>
-        <w:t xml:space="preserve">  AND h.created_at &gt;= DATE_TRUNC('year', CURRENT_DATE)</w:t>
-      </w:r>
-    </w:p>
-    <w:p>
-      <w:r>
-        <w:t xml:space="preserve">  AND h.created_at &lt; DATE_TRUNC('year', CURRENT_DATE) + INTERVAL '1 year'</w:t>
-      </w:r>
-    </w:p>
-    <w:p>
-      <w:r>
-        <w:t>GROUP BY h.claim_reference_no;</w:t>
+        <w:t xml:space="preserve">    </w:t>
+      </w:r>
+      <w:proofErr w:type="spellStart"/>
+      <w:proofErr w:type="gramStart"/>
+      <w:r>
+        <w:t>h.claim</w:t>
+      </w:r>
+      <w:proofErr w:type="gramEnd"/>
+      <w:r>
+        <w:t>_reference_no</w:t>
+      </w:r>
+      <w:proofErr w:type="spellEnd"/>
+      <w:r>
+        <w:t>,</w:t>
+      </w:r>
+    </w:p>
+    <w:p>
+      <w:r>
+        <w:t xml:space="preserve">    MAX(</w:t>
+      </w:r>
+      <w:proofErr w:type="spellStart"/>
+      <w:proofErr w:type="gramStart"/>
+      <w:r>
+        <w:t>h.created</w:t>
+      </w:r>
+      <w:proofErr w:type="gramEnd"/>
+      <w:r>
+        <w:t>_at</w:t>
+      </w:r>
+      <w:proofErr w:type="spellEnd"/>
+      <w:r>
+        <w:t xml:space="preserve">) AS </w:t>
+      </w:r>
+      <w:proofErr w:type="spellStart"/>
+      <w:r>
+        <w:t>closing_date</w:t>
+      </w:r>
+      <w:proofErr w:type="spellEnd"/>
+    </w:p>
+    <w:p>
+      <w:r>
+        <w:t xml:space="preserve">FROM </w:t>
+      </w:r>
+      <w:proofErr w:type="spellStart"/>
+      <w:proofErr w:type="gramStart"/>
+      <w:r>
+        <w:t>public.device</w:t>
+      </w:r>
+      <w:proofErr w:type="gramEnd"/>
+      <w:r>
+        <w:t>_claim_histories</w:t>
+      </w:r>
+      <w:proofErr w:type="spellEnd"/>
+      <w:r>
+        <w:t xml:space="preserve"> h</w:t>
+      </w:r>
+    </w:p>
+    <w:p>
+      <w:r>
+        <w:t xml:space="preserve">WHERE </w:t>
+      </w:r>
+      <w:proofErr w:type="spellStart"/>
+      <w:proofErr w:type="gramStart"/>
+      <w:r>
+        <w:t>h.claim</w:t>
+      </w:r>
+      <w:proofErr w:type="gramEnd"/>
+      <w:r>
+        <w:t>_reference_no</w:t>
+      </w:r>
+      <w:proofErr w:type="spellEnd"/>
+      <w:r>
+        <w:t xml:space="preserve"> = '14533'</w:t>
+      </w:r>
+    </w:p>
+    <w:p>
+      <w:r>
+        <w:t xml:space="preserve">  AND </w:t>
+      </w:r>
+      <w:proofErr w:type="spellStart"/>
+      <w:proofErr w:type="gramStart"/>
+      <w:r>
+        <w:t>h.current</w:t>
+      </w:r>
+      <w:proofErr w:type="gramEnd"/>
+      <w:r>
+        <w:t>_status</w:t>
+      </w:r>
+      <w:proofErr w:type="spellEnd"/>
+      <w:r>
+        <w:t xml:space="preserve"> = 10</w:t>
+      </w:r>
+    </w:p>
+    <w:p>
+      <w:r>
+        <w:t xml:space="preserve">  AND </w:t>
+      </w:r>
+      <w:proofErr w:type="spellStart"/>
+      <w:proofErr w:type="gramStart"/>
+      <w:r>
+        <w:t>h.created</w:t>
+      </w:r>
+      <w:proofErr w:type="gramEnd"/>
+      <w:r>
+        <w:t>_at</w:t>
+      </w:r>
+      <w:proofErr w:type="spellEnd"/>
+      <w:r>
+        <w:t xml:space="preserve"> &gt;= DATE_</w:t>
+      </w:r>
+      <w:proofErr w:type="gramStart"/>
+      <w:r>
+        <w:t>TRUNC(</w:t>
+      </w:r>
+      <w:proofErr w:type="gramEnd"/>
+      <w:r>
+        <w:t>'year', CURRENT_DATE)</w:t>
+      </w:r>
+    </w:p>
+    <w:p>
+      <w:r>
+        <w:t xml:space="preserve">  AND </w:t>
+      </w:r>
+      <w:proofErr w:type="spellStart"/>
+      <w:proofErr w:type="gramStart"/>
+      <w:r>
+        <w:t>h.created</w:t>
+      </w:r>
+      <w:proofErr w:type="gramEnd"/>
+      <w:r>
+        <w:t>_at</w:t>
+      </w:r>
+      <w:proofErr w:type="spellEnd"/>
+      <w:r>
+        <w:t xml:space="preserve"> &lt; DATE_</w:t>
+      </w:r>
+      <w:proofErr w:type="gramStart"/>
+      <w:r>
+        <w:t>TRUNC(</w:t>
+      </w:r>
+      <w:proofErr w:type="gramEnd"/>
+      <w:r>
+        <w:t>'year', CURRENT_DATE) + INTERVAL '1 year'</w:t>
+      </w:r>
+    </w:p>
+    <w:p>
+      <w:r>
+        <w:t xml:space="preserve">GROUP BY </w:t>
+      </w:r>
+      <w:proofErr w:type="spellStart"/>
+      <w:proofErr w:type="gramStart"/>
+      <w:r>
+        <w:t>h.claim</w:t>
+      </w:r>
+      <w:proofErr w:type="gramEnd"/>
+      <w:r>
+        <w:t>_reference_no</w:t>
+      </w:r>
+      <w:proofErr w:type="spellEnd"/>
+      <w:r>
+        <w:t>;</w:t>
       </w:r>
     </w:p>
     <w:p/>
@@ -494,97 +843,313 @@
           <w:sz w:val="22"/>
           <w:szCs w:val="22"/>
         </w:rPr>
-        <w:t xml:space="preserve">    h.claim_reference_no,</w:t>
-      </w:r>
-    </w:p>
-    <w:p>
-      <w:pPr>
+        <w:t xml:space="preserve">    </w:t>
+      </w:r>
+      <w:proofErr w:type="spellStart"/>
+      <w:proofErr w:type="gramStart"/>
+      <w:r>
         <w:rPr>
           <w:sz w:val="22"/>
           <w:szCs w:val="22"/>
         </w:rPr>
-      </w:pPr>
+        <w:t>h.claim</w:t>
+      </w:r>
+      <w:proofErr w:type="gramEnd"/>
       <w:r>
         <w:rPr>
           <w:sz w:val="22"/>
           <w:szCs w:val="22"/>
         </w:rPr>
-        <w:t xml:space="preserve">    MAX(h.created_at) AS closing_date</w:t>
-      </w:r>
-    </w:p>
-    <w:p>
-      <w:pPr>
+        <w:t>_reference_no</w:t>
+      </w:r>
+      <w:proofErr w:type="spellEnd"/>
+      <w:r>
         <w:rPr>
           <w:sz w:val="22"/>
           <w:szCs w:val="22"/>
         </w:rPr>
-      </w:pPr>
-      <w:r>
+        <w:t>,</w:t>
+      </w:r>
+    </w:p>
+    <w:p>
+      <w:pPr>
         <w:rPr>
           <w:sz w:val="22"/>
           <w:szCs w:val="22"/>
         </w:rPr>
-        <w:t>FROM public.device_claim_histories h</w:t>
-      </w:r>
-    </w:p>
-    <w:p>
-      <w:pPr>
+      </w:pPr>
+      <w:r>
         <w:rPr>
           <w:sz w:val="22"/>
           <w:szCs w:val="22"/>
         </w:rPr>
-      </w:pPr>
+        <w:t xml:space="preserve">    MAX(</w:t>
+      </w:r>
+      <w:proofErr w:type="spellStart"/>
+      <w:proofErr w:type="gramStart"/>
       <w:r>
         <w:rPr>
           <w:sz w:val="22"/>
           <w:szCs w:val="22"/>
         </w:rPr>
-        <w:t>WHERE h.current_status = 10</w:t>
-      </w:r>
-    </w:p>
-    <w:p>
-      <w:pPr>
+        <w:t>h.created</w:t>
+      </w:r>
+      <w:proofErr w:type="gramEnd"/>
+      <w:r>
         <w:rPr>
           <w:sz w:val="22"/>
           <w:szCs w:val="22"/>
         </w:rPr>
-      </w:pPr>
+        <w:t>_at</w:t>
+      </w:r>
+      <w:proofErr w:type="spellEnd"/>
       <w:r>
         <w:rPr>
           <w:sz w:val="22"/>
           <w:szCs w:val="22"/>
         </w:rPr>
-        <w:t xml:space="preserve">  AND h.created_at &gt;= DATE_TRUNC('year', CURRENT_DATE)</w:t>
-      </w:r>
-    </w:p>
-    <w:p>
-      <w:pPr>
+        <w:t xml:space="preserve">) AS </w:t>
+      </w:r>
+      <w:proofErr w:type="spellStart"/>
+      <w:r>
         <w:rPr>
           <w:sz w:val="22"/>
           <w:szCs w:val="22"/>
         </w:rPr>
-      </w:pPr>
-      <w:r>
+        <w:t>closing_date</w:t>
+      </w:r>
+      <w:proofErr w:type="spellEnd"/>
+    </w:p>
+    <w:p>
+      <w:pPr>
         <w:rPr>
           <w:sz w:val="22"/>
           <w:szCs w:val="22"/>
         </w:rPr>
-        <w:t xml:space="preserve">  AND h.created_at &lt; DATE_TRUNC('year', CURRENT_DATE) + INTERVAL '1 year'</w:t>
-      </w:r>
-    </w:p>
-    <w:p>
-      <w:pPr>
+      </w:pPr>
+      <w:r>
         <w:rPr>
           <w:sz w:val="22"/>
           <w:szCs w:val="22"/>
         </w:rPr>
-      </w:pPr>
+        <w:t xml:space="preserve">FROM </w:t>
+      </w:r>
+      <w:proofErr w:type="spellStart"/>
+      <w:proofErr w:type="gramStart"/>
       <w:r>
         <w:rPr>
           <w:sz w:val="22"/>
           <w:szCs w:val="22"/>
         </w:rPr>
-        <w:t>GROUP BY h.claim_reference_no;</w:t>
+        <w:t>public.device</w:t>
+      </w:r>
+      <w:proofErr w:type="gramEnd"/>
+      <w:r>
+        <w:rPr>
+          <w:sz w:val="22"/>
+          <w:szCs w:val="22"/>
+        </w:rPr>
+        <w:t>_claim_histories</w:t>
+      </w:r>
+      <w:proofErr w:type="spellEnd"/>
+      <w:r>
+        <w:rPr>
+          <w:sz w:val="22"/>
+          <w:szCs w:val="22"/>
+        </w:rPr>
+        <w:t xml:space="preserve"> h</w:t>
+      </w:r>
+    </w:p>
+    <w:p>
+      <w:pPr>
+        <w:rPr>
+          <w:sz w:val="22"/>
+          <w:szCs w:val="22"/>
+        </w:rPr>
+      </w:pPr>
+      <w:r>
+        <w:rPr>
+          <w:sz w:val="22"/>
+          <w:szCs w:val="22"/>
+        </w:rPr>
+        <w:t xml:space="preserve">WHERE </w:t>
+      </w:r>
+      <w:proofErr w:type="spellStart"/>
+      <w:proofErr w:type="gramStart"/>
+      <w:r>
+        <w:rPr>
+          <w:sz w:val="22"/>
+          <w:szCs w:val="22"/>
+        </w:rPr>
+        <w:t>h.current</w:t>
+      </w:r>
+      <w:proofErr w:type="gramEnd"/>
+      <w:r>
+        <w:rPr>
+          <w:sz w:val="22"/>
+          <w:szCs w:val="22"/>
+        </w:rPr>
+        <w:t>_status</w:t>
+      </w:r>
+      <w:proofErr w:type="spellEnd"/>
+      <w:r>
+        <w:rPr>
+          <w:sz w:val="22"/>
+          <w:szCs w:val="22"/>
+        </w:rPr>
+        <w:t xml:space="preserve"> = 10</w:t>
+      </w:r>
+    </w:p>
+    <w:p>
+      <w:pPr>
+        <w:rPr>
+          <w:sz w:val="22"/>
+          <w:szCs w:val="22"/>
+        </w:rPr>
+      </w:pPr>
+      <w:r>
+        <w:rPr>
+          <w:sz w:val="22"/>
+          <w:szCs w:val="22"/>
+        </w:rPr>
+        <w:t xml:space="preserve">  AND </w:t>
+      </w:r>
+      <w:proofErr w:type="spellStart"/>
+      <w:proofErr w:type="gramStart"/>
+      <w:r>
+        <w:rPr>
+          <w:sz w:val="22"/>
+          <w:szCs w:val="22"/>
+        </w:rPr>
+        <w:t>h.created</w:t>
+      </w:r>
+      <w:proofErr w:type="gramEnd"/>
+      <w:r>
+        <w:rPr>
+          <w:sz w:val="22"/>
+          <w:szCs w:val="22"/>
+        </w:rPr>
+        <w:t>_at</w:t>
+      </w:r>
+      <w:proofErr w:type="spellEnd"/>
+      <w:r>
+        <w:rPr>
+          <w:sz w:val="22"/>
+          <w:szCs w:val="22"/>
+        </w:rPr>
+        <w:t xml:space="preserve"> &gt;= DATE_</w:t>
+      </w:r>
+      <w:proofErr w:type="gramStart"/>
+      <w:r>
+        <w:rPr>
+          <w:sz w:val="22"/>
+          <w:szCs w:val="22"/>
+        </w:rPr>
+        <w:t>TRUNC(</w:t>
+      </w:r>
+      <w:proofErr w:type="gramEnd"/>
+      <w:r>
+        <w:rPr>
+          <w:sz w:val="22"/>
+          <w:szCs w:val="22"/>
+        </w:rPr>
+        <w:t>'year', CURRENT_DATE)</w:t>
+      </w:r>
+    </w:p>
+    <w:p>
+      <w:pPr>
+        <w:rPr>
+          <w:sz w:val="22"/>
+          <w:szCs w:val="22"/>
+        </w:rPr>
+      </w:pPr>
+      <w:r>
+        <w:rPr>
+          <w:sz w:val="22"/>
+          <w:szCs w:val="22"/>
+        </w:rPr>
+        <w:t xml:space="preserve">  AND </w:t>
+      </w:r>
+      <w:proofErr w:type="spellStart"/>
+      <w:proofErr w:type="gramStart"/>
+      <w:r>
+        <w:rPr>
+          <w:sz w:val="22"/>
+          <w:szCs w:val="22"/>
+        </w:rPr>
+        <w:t>h.created</w:t>
+      </w:r>
+      <w:proofErr w:type="gramEnd"/>
+      <w:r>
+        <w:rPr>
+          <w:sz w:val="22"/>
+          <w:szCs w:val="22"/>
+        </w:rPr>
+        <w:t>_at</w:t>
+      </w:r>
+      <w:proofErr w:type="spellEnd"/>
+      <w:r>
+        <w:rPr>
+          <w:sz w:val="22"/>
+          <w:szCs w:val="22"/>
+        </w:rPr>
+        <w:t xml:space="preserve"> &lt; DATE_</w:t>
+      </w:r>
+      <w:proofErr w:type="gramStart"/>
+      <w:r>
+        <w:rPr>
+          <w:sz w:val="22"/>
+          <w:szCs w:val="22"/>
+        </w:rPr>
+        <w:t>TRUNC(</w:t>
+      </w:r>
+      <w:proofErr w:type="gramEnd"/>
+      <w:r>
+        <w:rPr>
+          <w:sz w:val="22"/>
+          <w:szCs w:val="22"/>
+        </w:rPr>
+        <w:t>'year', CURRENT_DATE) + INTERVAL '1 year'</w:t>
+      </w:r>
+    </w:p>
+    <w:p>
+      <w:pPr>
+        <w:rPr>
+          <w:sz w:val="22"/>
+          <w:szCs w:val="22"/>
+        </w:rPr>
+      </w:pPr>
+      <w:r>
+        <w:rPr>
+          <w:sz w:val="22"/>
+          <w:szCs w:val="22"/>
+        </w:rPr>
+        <w:t xml:space="preserve">GROUP BY </w:t>
+      </w:r>
+      <w:proofErr w:type="spellStart"/>
+      <w:proofErr w:type="gramStart"/>
+      <w:r>
+        <w:rPr>
+          <w:sz w:val="22"/>
+          <w:szCs w:val="22"/>
+        </w:rPr>
+        <w:t>h.claim</w:t>
+      </w:r>
+      <w:proofErr w:type="gramEnd"/>
+      <w:r>
+        <w:rPr>
+          <w:sz w:val="22"/>
+          <w:szCs w:val="22"/>
+        </w:rPr>
+        <w:t>_reference_no</w:t>
+      </w:r>
+      <w:proofErr w:type="spellEnd"/>
+      <w:r>
+        <w:rPr>
+          <w:sz w:val="22"/>
+          <w:szCs w:val="22"/>
+        </w:rPr>
+        <w:t>;</w:t>
       </w:r>
     </w:p>
     <w:p/>
@@ -683,47 +1248,207 @@
     </w:p>
     <w:p>
       <w:r>
-        <w:t xml:space="preserve">    dc.reference_no_claim,</w:t>
-      </w:r>
-    </w:p>
-    <w:p>
-      <w:r>
-        <w:t xml:space="preserve">    MAX(dc.return_date) AS closing_date</w:t>
-      </w:r>
-    </w:p>
-    <w:p>
-      <w:r>
-        <w:t>FROM public.device_claims dc</w:t>
-      </w:r>
-    </w:p>
-    <w:p>
-      <w:r>
-        <w:t>WHERE dc.claim_status = 10</w:t>
-      </w:r>
-    </w:p>
-    <w:p>
-      <w:r>
-        <w:t xml:space="preserve">  AND dc.return_date IS NOT NULL</w:t>
-      </w:r>
-    </w:p>
-    <w:p>
-      <w:r>
-        <w:t xml:space="preserve">  AND dc.return_date::date &gt;= DATE_TRUNC('year', CURRENT_DATE)::date</w:t>
-      </w:r>
-    </w:p>
-    <w:p>
-      <w:r>
-        <w:t xml:space="preserve">  AND dc.return_date::date &lt; (DATE_TRUNC('year', CURRENT_DATE) + INTERVAL '1 year')::date</w:t>
-      </w:r>
-    </w:p>
-    <w:p>
-      <w:r>
-        <w:t>GROUP BY dc.reference_no_claim</w:t>
-      </w:r>
-    </w:p>
-    <w:p>
-      <w:r>
-        <w:t>ORDER BY closing_date DESC;</w:t>
+        <w:t xml:space="preserve">    </w:t>
+      </w:r>
+      <w:proofErr w:type="spellStart"/>
+      <w:r>
+        <w:t>dc.reference_no_claim</w:t>
+      </w:r>
+      <w:proofErr w:type="spellEnd"/>
+      <w:r>
+        <w:t>,</w:t>
+      </w:r>
+    </w:p>
+    <w:p>
+      <w:r>
+        <w:t xml:space="preserve">    </w:t>
+      </w:r>
+      <w:proofErr w:type="gramStart"/>
+      <w:r>
+        <w:t>MAX(</w:t>
+      </w:r>
+      <w:proofErr w:type="spellStart"/>
+      <w:r>
+        <w:t>dc.return</w:t>
+      </w:r>
+      <w:proofErr w:type="gramEnd"/>
+      <w:r>
+        <w:t>_date</w:t>
+      </w:r>
+      <w:proofErr w:type="spellEnd"/>
+      <w:r>
+        <w:t xml:space="preserve">) AS </w:t>
+      </w:r>
+      <w:proofErr w:type="spellStart"/>
+      <w:r>
+        <w:t>closing_date</w:t>
+      </w:r>
+      <w:proofErr w:type="spellEnd"/>
+    </w:p>
+    <w:p>
+      <w:r>
+        <w:t xml:space="preserve">FROM </w:t>
+      </w:r>
+      <w:proofErr w:type="spellStart"/>
+      <w:proofErr w:type="gramStart"/>
+      <w:r>
+        <w:t>public.device</w:t>
+      </w:r>
+      <w:proofErr w:type="gramEnd"/>
+      <w:r>
+        <w:t>_claims</w:t>
+      </w:r>
+      <w:proofErr w:type="spellEnd"/>
+      <w:r>
+        <w:t xml:space="preserve"> dc</w:t>
+      </w:r>
+    </w:p>
+    <w:p>
+      <w:r>
+        <w:t xml:space="preserve">WHERE </w:t>
+      </w:r>
+      <w:proofErr w:type="spellStart"/>
+      <w:proofErr w:type="gramStart"/>
+      <w:r>
+        <w:t>dc.claim</w:t>
+      </w:r>
+      <w:proofErr w:type="gramEnd"/>
+      <w:r>
+        <w:t>_status</w:t>
+      </w:r>
+      <w:proofErr w:type="spellEnd"/>
+      <w:r>
+        <w:t xml:space="preserve"> = 10</w:t>
+      </w:r>
+    </w:p>
+    <w:p>
+      <w:r>
+        <w:t xml:space="preserve">  AND </w:t>
+      </w:r>
+      <w:proofErr w:type="spellStart"/>
+      <w:proofErr w:type="gramStart"/>
+      <w:r>
+        <w:t>dc.return</w:t>
+      </w:r>
+      <w:proofErr w:type="gramEnd"/>
+      <w:r>
+        <w:t>_date</w:t>
+      </w:r>
+      <w:proofErr w:type="spellEnd"/>
+      <w:r>
+        <w:t xml:space="preserve"> IS NOT NULL</w:t>
+      </w:r>
+    </w:p>
+    <w:p>
+      <w:r>
+        <w:t xml:space="preserve">  AND </w:t>
+      </w:r>
+      <w:proofErr w:type="spellStart"/>
+      <w:proofErr w:type="gramStart"/>
+      <w:r>
+        <w:t>dc.return</w:t>
+      </w:r>
+      <w:proofErr w:type="gramEnd"/>
+      <w:r>
+        <w:t>_</w:t>
+      </w:r>
+      <w:proofErr w:type="gramStart"/>
+      <w:r>
+        <w:t>date</w:t>
+      </w:r>
+      <w:proofErr w:type="spellEnd"/>
+      <w:r>
+        <w:t>::</w:t>
+      </w:r>
+      <w:proofErr w:type="gramEnd"/>
+      <w:r>
+        <w:t>date &gt;= DATE_</w:t>
+      </w:r>
+      <w:proofErr w:type="gramStart"/>
+      <w:r>
+        <w:t>TRUNC(</w:t>
+      </w:r>
+      <w:proofErr w:type="gramEnd"/>
+      <w:r>
+        <w:t>'year', CURRENT_DATE</w:t>
+      </w:r>
+      <w:proofErr w:type="gramStart"/>
+      <w:r>
+        <w:t>)::</w:t>
+      </w:r>
+      <w:proofErr w:type="gramEnd"/>
+      <w:r>
+        <w:t>date</w:t>
+      </w:r>
+    </w:p>
+    <w:p>
+      <w:r>
+        <w:t xml:space="preserve">  AND </w:t>
+      </w:r>
+      <w:proofErr w:type="spellStart"/>
+      <w:proofErr w:type="gramStart"/>
+      <w:r>
+        <w:t>dc.return</w:t>
+      </w:r>
+      <w:proofErr w:type="gramEnd"/>
+      <w:r>
+        <w:t>_</w:t>
+      </w:r>
+      <w:proofErr w:type="gramStart"/>
+      <w:r>
+        <w:t>date</w:t>
+      </w:r>
+      <w:proofErr w:type="spellEnd"/>
+      <w:r>
+        <w:t>::</w:t>
+      </w:r>
+      <w:proofErr w:type="gramEnd"/>
+      <w:r>
+        <w:t>date &lt; (DATE_</w:t>
+      </w:r>
+      <w:proofErr w:type="gramStart"/>
+      <w:r>
+        <w:t>TRUNC(</w:t>
+      </w:r>
+      <w:proofErr w:type="gramEnd"/>
+      <w:r>
+        <w:t>'year', CURRENT_DATE) + INTERVAL '1 year'</w:t>
+      </w:r>
+      <w:proofErr w:type="gramStart"/>
+      <w:r>
+        <w:t>)::</w:t>
+      </w:r>
+      <w:proofErr w:type="gramEnd"/>
+      <w:r>
+        <w:t>date</w:t>
+      </w:r>
+    </w:p>
+    <w:p>
+      <w:r>
+        <w:t xml:space="preserve">GROUP BY </w:t>
+      </w:r>
+      <w:proofErr w:type="spellStart"/>
+      <w:proofErr w:type="gramStart"/>
+      <w:r>
+        <w:t>dc.reference</w:t>
+      </w:r>
+      <w:proofErr w:type="gramEnd"/>
+      <w:r>
+        <w:t>_no_claim</w:t>
+      </w:r>
+      <w:proofErr w:type="spellEnd"/>
+    </w:p>
+    <w:p>
+      <w:r>
+        <w:t xml:space="preserve">ORDER BY </w:t>
+      </w:r>
+      <w:proofErr w:type="spellStart"/>
+      <w:r>
+        <w:t>closing_date</w:t>
+      </w:r>
+      <w:proofErr w:type="spellEnd"/>
+      <w:r>
+        <w:t xml:space="preserve"> DESC;</w:t>
       </w:r>
     </w:p>
     <w:p/>
@@ -919,9 +1644,11 @@
       </w:r>
     </w:p>
     <w:p>
+      <w:proofErr w:type="spellStart"/>
       <w:r>
         <w:t>RefreshExcelPDF</w:t>
       </w:r>
+      <w:proofErr w:type="spellEnd"/>
     </w:p>
     <w:p>
       <w:r>
@@ -1067,7 +1794,15 @@
     <w:p/>
     <w:p>
       <w:r>
-        <w:t>WITH year_bounds AS (</w:t>
+        <w:t xml:space="preserve">WITH </w:t>
+      </w:r>
+      <w:proofErr w:type="spellStart"/>
+      <w:r>
+        <w:t>year_bounds</w:t>
+      </w:r>
+      <w:proofErr w:type="spellEnd"/>
+      <w:r>
+        <w:t xml:space="preserve"> AS (</w:t>
       </w:r>
     </w:p>
     <w:p>
@@ -1077,13 +1812,58 @@
     </w:p>
     <w:p>
       <w:r>
-        <w:t xml:space="preserve">        DATE_TRUNC('year', CURRENT_DATE)::date AS year_start,</w:t>
-      </w:r>
-    </w:p>
-    <w:p>
-      <w:r>
-        <w:t xml:space="preserve">        (DATE_TRUNC('year', CURRENT_DATE) + INTERVAL '1 year')::date AS next_year_start</w:t>
-      </w:r>
+        <w:t xml:space="preserve">        DATE_</w:t>
+      </w:r>
+      <w:proofErr w:type="gramStart"/>
+      <w:r>
+        <w:t>TRUNC(</w:t>
+      </w:r>
+      <w:proofErr w:type="gramEnd"/>
+      <w:r>
+        <w:t>'year', CURRENT_DATE</w:t>
+      </w:r>
+      <w:proofErr w:type="gramStart"/>
+      <w:r>
+        <w:t>)::</w:t>
+      </w:r>
+      <w:proofErr w:type="gramEnd"/>
+      <w:r>
+        <w:t xml:space="preserve">date AS </w:t>
+      </w:r>
+      <w:proofErr w:type="spellStart"/>
+      <w:r>
+        <w:t>year_start</w:t>
+      </w:r>
+      <w:proofErr w:type="spellEnd"/>
+      <w:r>
+        <w:t>,</w:t>
+      </w:r>
+    </w:p>
+    <w:p>
+      <w:r>
+        <w:t xml:space="preserve">        (DATE_</w:t>
+      </w:r>
+      <w:proofErr w:type="gramStart"/>
+      <w:r>
+        <w:t>TRUNC(</w:t>
+      </w:r>
+      <w:proofErr w:type="gramEnd"/>
+      <w:r>
+        <w:t>'year', CURRENT_DATE) + INTERVAL '1 year'</w:t>
+      </w:r>
+      <w:proofErr w:type="gramStart"/>
+      <w:r>
+        <w:t>)::</w:t>
+      </w:r>
+      <w:proofErr w:type="gramEnd"/>
+      <w:r>
+        <w:t xml:space="preserve">date AS </w:t>
+      </w:r>
+      <w:proofErr w:type="spellStart"/>
+      <w:r>
+        <w:t>next_year_start</w:t>
+      </w:r>
+      <w:proofErr w:type="spellEnd"/>
     </w:p>
     <w:p>
       <w:r>
@@ -1092,59 +1872,225 @@
     </w:p>
     <w:p/>
     <w:p>
-      <w:r>
-        <w:t>recovered_rows AS (</w:t>
-      </w:r>
-    </w:p>
-    <w:p>
-      <w:r>
-        <w:t xml:space="preserve">    SELECT DISTINCT ON (dc.reference_no_claim)</w:t>
-      </w:r>
-    </w:p>
-    <w:p>
-      <w:r>
-        <w:t xml:space="preserve">        dc.reference_no_claim,</w:t>
-      </w:r>
-    </w:p>
-    <w:p>
-      <w:r>
-        <w:t xml:space="preserve">        dc.return_date AS closing_date</w:t>
-      </w:r>
-    </w:p>
-    <w:p>
-      <w:r>
-        <w:t xml:space="preserve">    FROM public.device_claims dc</w:t>
-      </w:r>
-    </w:p>
-    <w:p>
-      <w:r>
-        <w:t xml:space="preserve">    CROSS JOIN year_bounds yb</w:t>
-      </w:r>
-    </w:p>
-    <w:p>
-      <w:r>
-        <w:t xml:space="preserve">    WHERE dc.claim_status = 10</w:t>
-      </w:r>
-    </w:p>
-    <w:p>
-      <w:r>
-        <w:t xml:space="preserve">      AND dc.reference_no_claim IS NOT NULL</w:t>
-      </w:r>
-    </w:p>
-    <w:p>
-      <w:r>
-        <w:t xml:space="preserve">      AND dc.return_date IS NOT NULL</w:t>
-      </w:r>
-    </w:p>
-    <w:p>
-      <w:r>
-        <w:t xml:space="preserve">      AND dc.return_date::date &gt;= yb.year_start</w:t>
-      </w:r>
-    </w:p>
-    <w:p>
-      <w:r>
-        <w:t xml:space="preserve">      AND dc.return_date::date &lt; yb.next_year_start</w:t>
-      </w:r>
+      <w:proofErr w:type="spellStart"/>
+      <w:r>
+        <w:t>recovered_rows</w:t>
+      </w:r>
+      <w:proofErr w:type="spellEnd"/>
+      <w:r>
+        <w:t xml:space="preserve"> AS (</w:t>
+      </w:r>
+    </w:p>
+    <w:p>
+      <w:r>
+        <w:t xml:space="preserve">    SELECT DISTINCT ON (</w:t>
+      </w:r>
+      <w:proofErr w:type="spellStart"/>
+      <w:proofErr w:type="gramStart"/>
+      <w:r>
+        <w:t>dc.reference</w:t>
+      </w:r>
+      <w:proofErr w:type="gramEnd"/>
+      <w:r>
+        <w:t>_no_claim</w:t>
+      </w:r>
+      <w:proofErr w:type="spellEnd"/>
+      <w:r>
+        <w:t>)</w:t>
+      </w:r>
+    </w:p>
+    <w:p>
+      <w:r>
+        <w:t xml:space="preserve">        </w:t>
+      </w:r>
+      <w:proofErr w:type="spellStart"/>
+      <w:r>
+        <w:t>dc.reference_no_claim</w:t>
+      </w:r>
+      <w:proofErr w:type="spellEnd"/>
+      <w:r>
+        <w:t>,</w:t>
+      </w:r>
+    </w:p>
+    <w:p>
+      <w:r>
+        <w:t xml:space="preserve">        </w:t>
+      </w:r>
+      <w:proofErr w:type="spellStart"/>
+      <w:r>
+        <w:t>dc.return_date</w:t>
+      </w:r>
+      <w:proofErr w:type="spellEnd"/>
+      <w:r>
+        <w:t xml:space="preserve"> AS </w:t>
+      </w:r>
+      <w:proofErr w:type="spellStart"/>
+      <w:r>
+        <w:t>closing_date</w:t>
+      </w:r>
+      <w:proofErr w:type="spellEnd"/>
+    </w:p>
+    <w:p>
+      <w:r>
+        <w:t xml:space="preserve">    FROM </w:t>
+      </w:r>
+      <w:proofErr w:type="spellStart"/>
+      <w:proofErr w:type="gramStart"/>
+      <w:r>
+        <w:t>public.device</w:t>
+      </w:r>
+      <w:proofErr w:type="gramEnd"/>
+      <w:r>
+        <w:t>_claims</w:t>
+      </w:r>
+      <w:proofErr w:type="spellEnd"/>
+      <w:r>
+        <w:t xml:space="preserve"> dc</w:t>
+      </w:r>
+    </w:p>
+    <w:p>
+      <w:r>
+        <w:t xml:space="preserve">    CROSS JOIN </w:t>
+      </w:r>
+      <w:proofErr w:type="spellStart"/>
+      <w:r>
+        <w:t>year_bounds</w:t>
+      </w:r>
+      <w:proofErr w:type="spellEnd"/>
+      <w:r>
+        <w:t xml:space="preserve"> </w:t>
+      </w:r>
+      <w:proofErr w:type="spellStart"/>
+      <w:r>
+        <w:t>yb</w:t>
+      </w:r>
+      <w:proofErr w:type="spellEnd"/>
+    </w:p>
+    <w:p>
+      <w:r>
+        <w:t xml:space="preserve">    WHERE </w:t>
+      </w:r>
+      <w:proofErr w:type="spellStart"/>
+      <w:proofErr w:type="gramStart"/>
+      <w:r>
+        <w:t>dc.claim</w:t>
+      </w:r>
+      <w:proofErr w:type="gramEnd"/>
+      <w:r>
+        <w:t>_status</w:t>
+      </w:r>
+      <w:proofErr w:type="spellEnd"/>
+      <w:r>
+        <w:t xml:space="preserve"> = 10</w:t>
+      </w:r>
+    </w:p>
+    <w:p>
+      <w:r>
+        <w:t xml:space="preserve">      AND </w:t>
+      </w:r>
+      <w:proofErr w:type="spellStart"/>
+      <w:proofErr w:type="gramStart"/>
+      <w:r>
+        <w:t>dc.reference</w:t>
+      </w:r>
+      <w:proofErr w:type="gramEnd"/>
+      <w:r>
+        <w:t>_no_claim</w:t>
+      </w:r>
+      <w:proofErr w:type="spellEnd"/>
+      <w:r>
+        <w:t xml:space="preserve"> IS NOT NULL</w:t>
+      </w:r>
+    </w:p>
+    <w:p>
+      <w:r>
+        <w:t xml:space="preserve">      AND </w:t>
+      </w:r>
+      <w:proofErr w:type="spellStart"/>
+      <w:proofErr w:type="gramStart"/>
+      <w:r>
+        <w:t>dc.return</w:t>
+      </w:r>
+      <w:proofErr w:type="gramEnd"/>
+      <w:r>
+        <w:t>_date</w:t>
+      </w:r>
+      <w:proofErr w:type="spellEnd"/>
+      <w:r>
+        <w:t xml:space="preserve"> IS NOT NULL</w:t>
+      </w:r>
+    </w:p>
+    <w:p>
+      <w:r>
+        <w:t xml:space="preserve">      AND </w:t>
+      </w:r>
+      <w:proofErr w:type="spellStart"/>
+      <w:proofErr w:type="gramStart"/>
+      <w:r>
+        <w:t>dc.return</w:t>
+      </w:r>
+      <w:proofErr w:type="gramEnd"/>
+      <w:r>
+        <w:t>_</w:t>
+      </w:r>
+      <w:proofErr w:type="gramStart"/>
+      <w:r>
+        <w:t>date</w:t>
+      </w:r>
+      <w:proofErr w:type="spellEnd"/>
+      <w:r>
+        <w:t>::</w:t>
+      </w:r>
+      <w:proofErr w:type="gramEnd"/>
+      <w:r>
+        <w:t xml:space="preserve">date &gt;= </w:t>
+      </w:r>
+      <w:proofErr w:type="spellStart"/>
+      <w:proofErr w:type="gramStart"/>
+      <w:r>
+        <w:t>yb.year</w:t>
+      </w:r>
+      <w:proofErr w:type="gramEnd"/>
+      <w:r>
+        <w:t>_start</w:t>
+      </w:r>
+      <w:proofErr w:type="spellEnd"/>
+    </w:p>
+    <w:p>
+      <w:r>
+        <w:t xml:space="preserve">      AND </w:t>
+      </w:r>
+      <w:proofErr w:type="spellStart"/>
+      <w:proofErr w:type="gramStart"/>
+      <w:r>
+        <w:t>dc.return</w:t>
+      </w:r>
+      <w:proofErr w:type="gramEnd"/>
+      <w:r>
+        <w:t>_</w:t>
+      </w:r>
+      <w:proofErr w:type="gramStart"/>
+      <w:r>
+        <w:t>date</w:t>
+      </w:r>
+      <w:proofErr w:type="spellEnd"/>
+      <w:r>
+        <w:t>::</w:t>
+      </w:r>
+      <w:proofErr w:type="gramEnd"/>
+      <w:r>
+        <w:t xml:space="preserve">date &lt; </w:t>
+      </w:r>
+      <w:proofErr w:type="spellStart"/>
+      <w:proofErr w:type="gramStart"/>
+      <w:r>
+        <w:t>yb.next</w:t>
+      </w:r>
+      <w:proofErr w:type="gramEnd"/>
+      <w:r>
+        <w:t>_year_start</w:t>
+      </w:r>
+      <w:proofErr w:type="spellEnd"/>
     </w:p>
     <w:p>
       <w:r>
@@ -1153,12 +2099,28 @@
     </w:p>
     <w:p>
       <w:r>
-        <w:t xml:space="preserve">        dc.reference_no_claim,</w:t>
-      </w:r>
-    </w:p>
-    <w:p>
-      <w:r>
-        <w:t xml:space="preserve">        dc.return_date DESC NULLS LAST,</w:t>
+        <w:t xml:space="preserve">        </w:t>
+      </w:r>
+      <w:proofErr w:type="spellStart"/>
+      <w:r>
+        <w:t>dc.reference_no_claim</w:t>
+      </w:r>
+      <w:proofErr w:type="spellEnd"/>
+      <w:r>
+        <w:t>,</w:t>
+      </w:r>
+    </w:p>
+    <w:p>
+      <w:r>
+        <w:t xml:space="preserve">        </w:t>
+      </w:r>
+      <w:proofErr w:type="spellStart"/>
+      <w:r>
+        <w:t>dc.return_date</w:t>
+      </w:r>
+      <w:proofErr w:type="spellEnd"/>
+      <w:r>
+        <w:t xml:space="preserve"> DESC NULLS LAST,</w:t>
       </w:r>
     </w:p>
     <w:p>
@@ -1174,12 +2136,33 @@
     <w:p/>
     <w:p>
       <w:r>
-        <w:t>SELECT COUNT(*) AS recovered_count</w:t>
-      </w:r>
-    </w:p>
-    <w:p>
-      <w:r>
-        <w:t>FROM recovered_rows;</w:t>
+        <w:t xml:space="preserve">SELECT </w:t>
+      </w:r>
+      <w:proofErr w:type="gramStart"/>
+      <w:r>
+        <w:t>COUNT(</w:t>
+      </w:r>
+      <w:proofErr w:type="gramEnd"/>
+      <w:r>
+        <w:t xml:space="preserve">*) AS </w:t>
+      </w:r>
+      <w:proofErr w:type="spellStart"/>
+      <w:r>
+        <w:t>recovered_count</w:t>
+      </w:r>
+      <w:proofErr w:type="spellEnd"/>
+    </w:p>
+    <w:p>
+      <w:r>
+        <w:t xml:space="preserve">FROM </w:t>
+      </w:r>
+      <w:proofErr w:type="spellStart"/>
+      <w:r>
+        <w:t>recovered_rows</w:t>
+      </w:r>
+      <w:proofErr w:type="spellEnd"/>
+      <w:r>
+        <w:t>;</w:t>
       </w:r>
     </w:p>
     <w:p/>
@@ -1230,47 +2213,207 @@
     </w:p>
     <w:p>
       <w:r>
-        <w:t xml:space="preserve">    dc.reference_no_claim,</w:t>
-      </w:r>
-    </w:p>
-    <w:p>
-      <w:r>
-        <w:t xml:space="preserve">    MAX(dc.return_date) AS closing_date</w:t>
-      </w:r>
-    </w:p>
-    <w:p>
-      <w:r>
-        <w:t>FROM public.device_claims dc</w:t>
-      </w:r>
-    </w:p>
-    <w:p>
-      <w:r>
-        <w:t>WHERE dc.claim_status = 10</w:t>
-      </w:r>
-    </w:p>
-    <w:p>
-      <w:r>
-        <w:t xml:space="preserve">  AND dc.return_date IS NOT NULL</w:t>
-      </w:r>
-    </w:p>
-    <w:p>
-      <w:r>
-        <w:t xml:space="preserve">  AND dc.return_date::date &gt;= DATE_TRUNC('year', CURRENT_DATE)::date</w:t>
-      </w:r>
-    </w:p>
-    <w:p>
-      <w:r>
-        <w:t xml:space="preserve">  AND dc.return_date::date &lt; (DATE_TRUNC('year', CURRENT_DATE) + INTERVAL '1 year')::date</w:t>
-      </w:r>
-    </w:p>
-    <w:p>
-      <w:r>
-        <w:t>GROUP BY dc.reference_no_claim</w:t>
-      </w:r>
-    </w:p>
-    <w:p>
-      <w:r>
-        <w:t>ORDER BY closing_date DESC;</w:t>
+        <w:t xml:space="preserve">    </w:t>
+      </w:r>
+      <w:proofErr w:type="spellStart"/>
+      <w:r>
+        <w:t>dc.reference_no_claim</w:t>
+      </w:r>
+      <w:proofErr w:type="spellEnd"/>
+      <w:r>
+        <w:t>,</w:t>
+      </w:r>
+    </w:p>
+    <w:p>
+      <w:r>
+        <w:t xml:space="preserve">    </w:t>
+      </w:r>
+      <w:proofErr w:type="gramStart"/>
+      <w:r>
+        <w:t>MAX(</w:t>
+      </w:r>
+      <w:proofErr w:type="spellStart"/>
+      <w:r>
+        <w:t>dc.return</w:t>
+      </w:r>
+      <w:proofErr w:type="gramEnd"/>
+      <w:r>
+        <w:t>_date</w:t>
+      </w:r>
+      <w:proofErr w:type="spellEnd"/>
+      <w:r>
+        <w:t xml:space="preserve">) AS </w:t>
+      </w:r>
+      <w:proofErr w:type="spellStart"/>
+      <w:r>
+        <w:t>closing_date</w:t>
+      </w:r>
+      <w:proofErr w:type="spellEnd"/>
+    </w:p>
+    <w:p>
+      <w:r>
+        <w:t xml:space="preserve">FROM </w:t>
+      </w:r>
+      <w:proofErr w:type="spellStart"/>
+      <w:proofErr w:type="gramStart"/>
+      <w:r>
+        <w:t>public.device</w:t>
+      </w:r>
+      <w:proofErr w:type="gramEnd"/>
+      <w:r>
+        <w:t>_claims</w:t>
+      </w:r>
+      <w:proofErr w:type="spellEnd"/>
+      <w:r>
+        <w:t xml:space="preserve"> dc</w:t>
+      </w:r>
+    </w:p>
+    <w:p>
+      <w:r>
+        <w:t xml:space="preserve">WHERE </w:t>
+      </w:r>
+      <w:proofErr w:type="spellStart"/>
+      <w:proofErr w:type="gramStart"/>
+      <w:r>
+        <w:t>dc.claim</w:t>
+      </w:r>
+      <w:proofErr w:type="gramEnd"/>
+      <w:r>
+        <w:t>_status</w:t>
+      </w:r>
+      <w:proofErr w:type="spellEnd"/>
+      <w:r>
+        <w:t xml:space="preserve"> = 10</w:t>
+      </w:r>
+    </w:p>
+    <w:p>
+      <w:r>
+        <w:t xml:space="preserve">  AND </w:t>
+      </w:r>
+      <w:proofErr w:type="spellStart"/>
+      <w:proofErr w:type="gramStart"/>
+      <w:r>
+        <w:t>dc.return</w:t>
+      </w:r>
+      <w:proofErr w:type="gramEnd"/>
+      <w:r>
+        <w:t>_date</w:t>
+      </w:r>
+      <w:proofErr w:type="spellEnd"/>
+      <w:r>
+        <w:t xml:space="preserve"> IS NOT NULL</w:t>
+      </w:r>
+    </w:p>
+    <w:p>
+      <w:r>
+        <w:t xml:space="preserve">  AND </w:t>
+      </w:r>
+      <w:proofErr w:type="spellStart"/>
+      <w:proofErr w:type="gramStart"/>
+      <w:r>
+        <w:t>dc.return</w:t>
+      </w:r>
+      <w:proofErr w:type="gramEnd"/>
+      <w:r>
+        <w:t>_</w:t>
+      </w:r>
+      <w:proofErr w:type="gramStart"/>
+      <w:r>
+        <w:t>date</w:t>
+      </w:r>
+      <w:proofErr w:type="spellEnd"/>
+      <w:r>
+        <w:t>::</w:t>
+      </w:r>
+      <w:proofErr w:type="gramEnd"/>
+      <w:r>
+        <w:t>date &gt;= DATE_</w:t>
+      </w:r>
+      <w:proofErr w:type="gramStart"/>
+      <w:r>
+        <w:t>TRUNC(</w:t>
+      </w:r>
+      <w:proofErr w:type="gramEnd"/>
+      <w:r>
+        <w:t>'year', CURRENT_DATE</w:t>
+      </w:r>
+      <w:proofErr w:type="gramStart"/>
+      <w:r>
+        <w:t>)::</w:t>
+      </w:r>
+      <w:proofErr w:type="gramEnd"/>
+      <w:r>
+        <w:t>date</w:t>
+      </w:r>
+    </w:p>
+    <w:p>
+      <w:r>
+        <w:t xml:space="preserve">  AND </w:t>
+      </w:r>
+      <w:proofErr w:type="spellStart"/>
+      <w:proofErr w:type="gramStart"/>
+      <w:r>
+        <w:t>dc.return</w:t>
+      </w:r>
+      <w:proofErr w:type="gramEnd"/>
+      <w:r>
+        <w:t>_</w:t>
+      </w:r>
+      <w:proofErr w:type="gramStart"/>
+      <w:r>
+        <w:t>date</w:t>
+      </w:r>
+      <w:proofErr w:type="spellEnd"/>
+      <w:r>
+        <w:t>::</w:t>
+      </w:r>
+      <w:proofErr w:type="gramEnd"/>
+      <w:r>
+        <w:t>date &lt; (DATE_</w:t>
+      </w:r>
+      <w:proofErr w:type="gramStart"/>
+      <w:r>
+        <w:t>TRUNC(</w:t>
+      </w:r>
+      <w:proofErr w:type="gramEnd"/>
+      <w:r>
+        <w:t>'year', CURRENT_DATE) + INTERVAL '1 year'</w:t>
+      </w:r>
+      <w:proofErr w:type="gramStart"/>
+      <w:r>
+        <w:t>)::</w:t>
+      </w:r>
+      <w:proofErr w:type="gramEnd"/>
+      <w:r>
+        <w:t>date</w:t>
+      </w:r>
+    </w:p>
+    <w:p>
+      <w:r>
+        <w:t xml:space="preserve">GROUP BY </w:t>
+      </w:r>
+      <w:proofErr w:type="spellStart"/>
+      <w:proofErr w:type="gramStart"/>
+      <w:r>
+        <w:t>dc.reference</w:t>
+      </w:r>
+      <w:proofErr w:type="gramEnd"/>
+      <w:r>
+        <w:t>_no_claim</w:t>
+      </w:r>
+      <w:proofErr w:type="spellEnd"/>
+    </w:p>
+    <w:p>
+      <w:r>
+        <w:t xml:space="preserve">ORDER BY </w:t>
+      </w:r>
+      <w:proofErr w:type="spellStart"/>
+      <w:r>
+        <w:t>closing_date</w:t>
+      </w:r>
+      <w:proofErr w:type="spellEnd"/>
+      <w:r>
+        <w:t xml:space="preserve"> DESC;</w:t>
       </w:r>
     </w:p>
     <w:p/>
@@ -1433,8 +2576,21 @@
     </w:p>
     <w:p/>
     <w:p>
-      <w:r>
-        <w:t xml:space="preserve">Method : GET : </w:t>
+      <w:proofErr w:type="gramStart"/>
+      <w:r>
+        <w:t>Method :</w:t>
+      </w:r>
+      <w:proofErr w:type="gramEnd"/>
+      <w:r>
+        <w:t xml:space="preserve"> </w:t>
+      </w:r>
+      <w:proofErr w:type="gramStart"/>
+      <w:r>
+        <w:t>GET :</w:t>
+      </w:r>
+      <w:proofErr w:type="gramEnd"/>
+      <w:r>
+        <w:t xml:space="preserve"> </w:t>
       </w:r>
       <w:hyperlink r:id="rId18" w:history="1">
         <w:r>
@@ -1488,7 +2644,20 @@
     </w:p>
     <w:p>
       <w:r>
-        <w:t>            "emp_id": </w:t>
+        <w:t>            "</w:t>
+      </w:r>
+      <w:proofErr w:type="spellStart"/>
+      <w:proofErr w:type="gramStart"/>
+      <w:r>
+        <w:t>emp</w:t>
+      </w:r>
+      <w:proofErr w:type="gramEnd"/>
+      <w:r>
+        <w:t>_id</w:t>
+      </w:r>
+      <w:proofErr w:type="spellEnd"/>
+      <w:r>
+        <w:t>": </w:t>
       </w:r>
       <w:r>
         <w:rPr>
@@ -1568,12 +2737,38 @@
     </w:p>
     <w:p>
       <w:r>
-        <w:t>            "device_serial": "n0sn5602",</w:t>
-      </w:r>
-    </w:p>
-    <w:p>
-      <w:r>
-        <w:t>            "warranty_date": </w:t>
+        <w:t>            "</w:t>
+      </w:r>
+      <w:proofErr w:type="spellStart"/>
+      <w:proofErr w:type="gramStart"/>
+      <w:r>
+        <w:t>device</w:t>
+      </w:r>
+      <w:proofErr w:type="gramEnd"/>
+      <w:r>
+        <w:t>_serial</w:t>
+      </w:r>
+      <w:proofErr w:type="spellEnd"/>
+      <w:r>
+        <w:t>": "n0sn5602",</w:t>
+      </w:r>
+    </w:p>
+    <w:p>
+      <w:r>
+        <w:t>            "</w:t>
+      </w:r>
+      <w:proofErr w:type="spellStart"/>
+      <w:proofErr w:type="gramStart"/>
+      <w:r>
+        <w:t>warranty</w:t>
+      </w:r>
+      <w:proofErr w:type="gramEnd"/>
+      <w:r>
+        <w:t>_date</w:t>
+      </w:r>
+      <w:proofErr w:type="spellEnd"/>
+      <w:r>
+        <w:t>": </w:t>
       </w:r>
       <w:r>
         <w:rPr>
@@ -1603,7 +2798,20 @@
     </w:p>
     <w:p>
       <w:r>
-        <w:t>            "created_at": "2026-05-07 10:59:12+06"</w:t>
+        <w:t>            "</w:t>
+      </w:r>
+      <w:proofErr w:type="spellStart"/>
+      <w:proofErr w:type="gramStart"/>
+      <w:r>
+        <w:t>created</w:t>
+      </w:r>
+      <w:proofErr w:type="gramEnd"/>
+      <w:r>
+        <w:t>_at</w:t>
+      </w:r>
+      <w:proofErr w:type="spellEnd"/>
+      <w:r>
+        <w:t>": "2026-05-07 10:59:12+06"</w:t>
       </w:r>
     </w:p>
     <w:p>
@@ -1644,7 +2852,20 @@
     </w:p>
     <w:p>
       <w:r>
-        <w:t>            "emp_id": </w:t>
+        <w:t>            "</w:t>
+      </w:r>
+      <w:proofErr w:type="spellStart"/>
+      <w:proofErr w:type="gramStart"/>
+      <w:r>
+        <w:t>emp</w:t>
+      </w:r>
+      <w:proofErr w:type="gramEnd"/>
+      <w:r>
+        <w:t>_id</w:t>
+      </w:r>
+      <w:proofErr w:type="spellEnd"/>
+      <w:r>
+        <w:t>": </w:t>
       </w:r>
       <w:r>
         <w:rPr>
@@ -1724,12 +2945,38 @@
     </w:p>
     <w:p>
       <w:r>
-        <w:t>            "device_serial": "F8F19T3",</w:t>
-      </w:r>
-    </w:p>
-    <w:p>
-      <w:r>
-        <w:t>            "warranty_date": </w:t>
+        <w:t>            "</w:t>
+      </w:r>
+      <w:proofErr w:type="spellStart"/>
+      <w:proofErr w:type="gramStart"/>
+      <w:r>
+        <w:t>device</w:t>
+      </w:r>
+      <w:proofErr w:type="gramEnd"/>
+      <w:r>
+        <w:t>_serial</w:t>
+      </w:r>
+      <w:proofErr w:type="spellEnd"/>
+      <w:r>
+        <w:t>": "F8F19T3",</w:t>
+      </w:r>
+    </w:p>
+    <w:p>
+      <w:r>
+        <w:t>            "</w:t>
+      </w:r>
+      <w:proofErr w:type="spellStart"/>
+      <w:proofErr w:type="gramStart"/>
+      <w:r>
+        <w:t>warranty</w:t>
+      </w:r>
+      <w:proofErr w:type="gramEnd"/>
+      <w:r>
+        <w:t>_date</w:t>
+      </w:r>
+      <w:proofErr w:type="spellEnd"/>
+      <w:r>
+        <w:t>": </w:t>
       </w:r>
       <w:r>
         <w:rPr>
@@ -1754,12 +3001,41 @@
     </w:p>
     <w:p>
       <w:r>
-        <w:t>            "problems": "1. Laptop cooling fan error â€“ needs replacement.\r\n2. Display color issues",</w:t>
-      </w:r>
-    </w:p>
-    <w:p>
-      <w:r>
-        <w:t>            "created_at": "2026-05-04 15:25:17+06"</w:t>
+        <w:t>            "problems": "1. Laptop cooling fan error â</w:t>
+      </w:r>
+      <w:proofErr w:type="gramStart"/>
+      <w:r>
+        <w:t>€“ needs</w:t>
+      </w:r>
+      <w:proofErr w:type="gramEnd"/>
+      <w:r>
+        <w:t> </w:t>
+      </w:r>
+      <w:proofErr w:type="gramStart"/>
+      <w:r>
+        <w:t>replacement.\r\n2</w:t>
+      </w:r>
+      <w:proofErr w:type="gramEnd"/>
+      <w:r>
+        <w:t>. Display color issues",</w:t>
+      </w:r>
+    </w:p>
+    <w:p>
+      <w:r>
+        <w:t>            "</w:t>
+      </w:r>
+      <w:proofErr w:type="spellStart"/>
+      <w:proofErr w:type="gramStart"/>
+      <w:r>
+        <w:t>created</w:t>
+      </w:r>
+      <w:proofErr w:type="gramEnd"/>
+      <w:r>
+        <w:t>_at</w:t>
+      </w:r>
+      <w:proofErr w:type="spellEnd"/>
+      <w:r>
+        <w:t>": "2026-05-04 15:25:17+06"</w:t>
       </w:r>
     </w:p>
     <w:p>
@@ -1799,7 +3075,20 @@
     </w:p>
     <w:p>
       <w:r>
-        <w:t>            "emp_id": </w:t>
+        <w:t>            "</w:t>
+      </w:r>
+      <w:proofErr w:type="spellStart"/>
+      <w:proofErr w:type="gramStart"/>
+      <w:r>
+        <w:t>emp</w:t>
+      </w:r>
+      <w:proofErr w:type="gramEnd"/>
+      <w:r>
+        <w:t>_id</w:t>
+      </w:r>
+      <w:proofErr w:type="spellEnd"/>
+      <w:r>
+        <w:t>": </w:t>
       </w:r>
       <w:r>
         <w:rPr>
@@ -1880,12 +3169,33 @@
     <w:p>
       <w:r>
         <w:lastRenderedPageBreak/>
-        <w:t>            "device_serial": "C5BLDHL041025018      M- 25361B009134",</w:t>
-      </w:r>
-    </w:p>
-    <w:p>
-      <w:r>
-        <w:t>            "warranty_date": </w:t>
+        <w:t>            "</w:t>
+      </w:r>
+      <w:proofErr w:type="gramStart"/>
+      <w:r>
+        <w:t>device</w:t>
+      </w:r>
+      <w:proofErr w:type="gramEnd"/>
+      <w:r>
+        <w:t>_serial": "C5BLDHL041025018      M- 25361B009134",</w:t>
+      </w:r>
+    </w:p>
+    <w:p>
+      <w:r>
+        <w:t>            "</w:t>
+      </w:r>
+      <w:proofErr w:type="spellStart"/>
+      <w:proofErr w:type="gramStart"/>
+      <w:r>
+        <w:t>warranty</w:t>
+      </w:r>
+      <w:proofErr w:type="gramEnd"/>
+      <w:r>
+        <w:t>_date</w:t>
+      </w:r>
+      <w:proofErr w:type="spellEnd"/>
+      <w:r>
+        <w:t>": </w:t>
       </w:r>
       <w:r>
         <w:rPr>
@@ -1910,12 +3220,33 @@
     </w:p>
     <w:p>
       <w:r>
-        <w:t>            "problems": "No Power (This Is the Second Time. The First Time, the Power Supply Was Replaced.)\r\n",</w:t>
-      </w:r>
-    </w:p>
-    <w:p>
-      <w:r>
-        <w:t>            "created_at": "2026-04-27 13:20:43+06"</w:t>
+        <w:t>            "problems": "No Power (This Is the Second Time. The First Time, the Power Supply Was Replaced</w:t>
+      </w:r>
+      <w:proofErr w:type="gramStart"/>
+      <w:r>
+        <w:t>.)\r\n</w:t>
+      </w:r>
+      <w:proofErr w:type="gramEnd"/>
+      <w:r>
+        <w:t>",</w:t>
+      </w:r>
+    </w:p>
+    <w:p>
+      <w:r>
+        <w:t>            "</w:t>
+      </w:r>
+      <w:proofErr w:type="spellStart"/>
+      <w:proofErr w:type="gramStart"/>
+      <w:r>
+        <w:t>created</w:t>
+      </w:r>
+      <w:proofErr w:type="gramEnd"/>
+      <w:r>
+        <w:t>_at</w:t>
+      </w:r>
+      <w:proofErr w:type="spellEnd"/>
+      <w:r>
+        <w:t>": "2026-04-27 13:20:43+06"</w:t>
       </w:r>
     </w:p>
     <w:p>
@@ -1955,7 +3286,20 @@
     </w:p>
     <w:p>
       <w:r>
-        <w:t>            "emp_id": </w:t>
+        <w:t>            "</w:t>
+      </w:r>
+      <w:proofErr w:type="spellStart"/>
+      <w:proofErr w:type="gramStart"/>
+      <w:r>
+        <w:t>emp</w:t>
+      </w:r>
+      <w:proofErr w:type="gramEnd"/>
+      <w:r>
+        <w:t>_id</w:t>
+      </w:r>
+      <w:proofErr w:type="spellEnd"/>
+      <w:r>
+        <w:t>": </w:t>
       </w:r>
       <w:r>
         <w:rPr>
@@ -2035,12 +3379,38 @@
     </w:p>
     <w:p>
       <w:r>
-        <w:t>            "device_serial": "H68SGJ3",</w:t>
-      </w:r>
-    </w:p>
-    <w:p>
-      <w:r>
-        <w:t>            "warranty_date": </w:t>
+        <w:t>            "</w:t>
+      </w:r>
+      <w:proofErr w:type="spellStart"/>
+      <w:proofErr w:type="gramStart"/>
+      <w:r>
+        <w:t>device</w:t>
+      </w:r>
+      <w:proofErr w:type="gramEnd"/>
+      <w:r>
+        <w:t>_serial</w:t>
+      </w:r>
+      <w:proofErr w:type="spellEnd"/>
+      <w:r>
+        <w:t>": "H68SGJ3",</w:t>
+      </w:r>
+    </w:p>
+    <w:p>
+      <w:r>
+        <w:t>            "</w:t>
+      </w:r>
+      <w:proofErr w:type="spellStart"/>
+      <w:proofErr w:type="gramStart"/>
+      <w:r>
+        <w:t>warranty</w:t>
+      </w:r>
+      <w:proofErr w:type="gramEnd"/>
+      <w:r>
+        <w:t>_date</w:t>
+      </w:r>
+      <w:proofErr w:type="spellEnd"/>
+      <w:r>
+        <w:t>": </w:t>
       </w:r>
       <w:r>
         <w:rPr>
@@ -2070,7 +3440,20 @@
     </w:p>
     <w:p>
       <w:r>
-        <w:t>            "created_at": "2026-04-27 13:19:35+06"</w:t>
+        <w:t>            "</w:t>
+      </w:r>
+      <w:proofErr w:type="spellStart"/>
+      <w:proofErr w:type="gramStart"/>
+      <w:r>
+        <w:t>created</w:t>
+      </w:r>
+      <w:proofErr w:type="gramEnd"/>
+      <w:r>
+        <w:t>_at</w:t>
+      </w:r>
+      <w:proofErr w:type="spellEnd"/>
+      <w:r>
+        <w:t>": "2026-04-27 13:19:35+06"</w:t>
       </w:r>
     </w:p>
     <w:p>
@@ -2111,7 +3494,20 @@
     </w:p>
     <w:p>
       <w:r>
-        <w:t>            "emp_id": </w:t>
+        <w:t>            "</w:t>
+      </w:r>
+      <w:proofErr w:type="spellStart"/>
+      <w:proofErr w:type="gramStart"/>
+      <w:r>
+        <w:t>emp</w:t>
+      </w:r>
+      <w:proofErr w:type="gramEnd"/>
+      <w:r>
+        <w:t>_id</w:t>
+      </w:r>
+      <w:proofErr w:type="spellEnd"/>
+      <w:r>
+        <w:t>": </w:t>
       </w:r>
       <w:r>
         <w:rPr>
@@ -2191,12 +3587,38 @@
     </w:p>
     <w:p>
       <w:r>
-        <w:t>            "device_serial": "5CD3062R5P",</w:t>
-      </w:r>
-    </w:p>
-    <w:p>
-      <w:r>
-        <w:t>            "warranty_date": </w:t>
+        <w:t>            "</w:t>
+      </w:r>
+      <w:proofErr w:type="spellStart"/>
+      <w:proofErr w:type="gramStart"/>
+      <w:r>
+        <w:t>device</w:t>
+      </w:r>
+      <w:proofErr w:type="gramEnd"/>
+      <w:r>
+        <w:t>_serial</w:t>
+      </w:r>
+      <w:proofErr w:type="spellEnd"/>
+      <w:r>
+        <w:t>": "5CD3062R5P",</w:t>
+      </w:r>
+    </w:p>
+    <w:p>
+      <w:r>
+        <w:t>            "</w:t>
+      </w:r>
+      <w:proofErr w:type="spellStart"/>
+      <w:proofErr w:type="gramStart"/>
+      <w:r>
+        <w:t>warranty</w:t>
+      </w:r>
+      <w:proofErr w:type="gramEnd"/>
+      <w:r>
+        <w:t>_date</w:t>
+      </w:r>
+      <w:proofErr w:type="spellEnd"/>
+      <w:r>
+        <w:t>": </w:t>
       </w:r>
       <w:r>
         <w:rPr>
@@ -2226,7 +3648,20 @@
     </w:p>
     <w:p>
       <w:r>
-        <w:t>            "created_at": "2026-04-27 13:18:07+06"</w:t>
+        <w:t>            "</w:t>
+      </w:r>
+      <w:proofErr w:type="spellStart"/>
+      <w:proofErr w:type="gramStart"/>
+      <w:r>
+        <w:t>created</w:t>
+      </w:r>
+      <w:proofErr w:type="gramEnd"/>
+      <w:r>
+        <w:t>_at</w:t>
+      </w:r>
+      <w:proofErr w:type="spellEnd"/>
+      <w:r>
+        <w:t>": "2026-04-27 13:18:07+06"</w:t>
       </w:r>
     </w:p>
     <w:p>
@@ -2266,7 +3701,20 @@
     </w:p>
     <w:p>
       <w:r>
-        <w:t>            "emp_id": </w:t>
+        <w:t>            "</w:t>
+      </w:r>
+      <w:proofErr w:type="spellStart"/>
+      <w:proofErr w:type="gramStart"/>
+      <w:r>
+        <w:t>emp</w:t>
+      </w:r>
+      <w:proofErr w:type="gramEnd"/>
+      <w:r>
+        <w:t>_id</w:t>
+      </w:r>
+      <w:proofErr w:type="spellEnd"/>
+      <w:r>
+        <w:t>": </w:t>
       </w:r>
       <w:r>
         <w:rPr>
@@ -2347,12 +3795,38 @@
     <w:p>
       <w:r>
         <w:lastRenderedPageBreak/>
-        <w:t>            "device_serial": "5CD536F3FC",</w:t>
-      </w:r>
-    </w:p>
-    <w:p>
-      <w:r>
-        <w:t>            "warranty_date": </w:t>
+        <w:t>            "</w:t>
+      </w:r>
+      <w:proofErr w:type="spellStart"/>
+      <w:proofErr w:type="gramStart"/>
+      <w:r>
+        <w:t>device</w:t>
+      </w:r>
+      <w:proofErr w:type="gramEnd"/>
+      <w:r>
+        <w:t>_serial</w:t>
+      </w:r>
+      <w:proofErr w:type="spellEnd"/>
+      <w:r>
+        <w:t>": "5CD536F3FC",</w:t>
+      </w:r>
+    </w:p>
+    <w:p>
+      <w:r>
+        <w:t>            "</w:t>
+      </w:r>
+      <w:proofErr w:type="spellStart"/>
+      <w:proofErr w:type="gramStart"/>
+      <w:r>
+        <w:t>warranty</w:t>
+      </w:r>
+      <w:proofErr w:type="gramEnd"/>
+      <w:r>
+        <w:t>_date</w:t>
+      </w:r>
+      <w:proofErr w:type="spellEnd"/>
+      <w:r>
+        <w:t>": </w:t>
       </w:r>
       <w:r>
         <w:rPr>
@@ -2382,7 +3856,20 @@
     </w:p>
     <w:p>
       <w:r>
-        <w:t>            "created_at": "2026-04-27 13:16:13+06"</w:t>
+        <w:t>            "</w:t>
+      </w:r>
+      <w:proofErr w:type="spellStart"/>
+      <w:proofErr w:type="gramStart"/>
+      <w:r>
+        <w:t>created</w:t>
+      </w:r>
+      <w:proofErr w:type="gramEnd"/>
+      <w:r>
+        <w:t>_at</w:t>
+      </w:r>
+      <w:proofErr w:type="spellEnd"/>
+      <w:r>
+        <w:t>": "2026-04-27 13:16:13+06"</w:t>
       </w:r>
     </w:p>
     <w:p>
@@ -2422,7 +3909,20 @@
     </w:p>
     <w:p>
       <w:r>
-        <w:t>            "emp_id": </w:t>
+        <w:t>            "</w:t>
+      </w:r>
+      <w:proofErr w:type="spellStart"/>
+      <w:proofErr w:type="gramStart"/>
+      <w:r>
+        <w:t>emp</w:t>
+      </w:r>
+      <w:proofErr w:type="gramEnd"/>
+      <w:r>
+        <w:t>_id</w:t>
+      </w:r>
+      <w:proofErr w:type="spellEnd"/>
+      <w:r>
+        <w:t>": </w:t>
       </w:r>
       <w:r>
         <w:rPr>
@@ -2502,12 +4002,38 @@
     </w:p>
     <w:p>
       <w:r>
-        <w:t>            "device_serial": "2RL19T3",</w:t>
-      </w:r>
-    </w:p>
-    <w:p>
-      <w:r>
-        <w:t>            "warranty_date": </w:t>
+        <w:t>            "</w:t>
+      </w:r>
+      <w:proofErr w:type="spellStart"/>
+      <w:proofErr w:type="gramStart"/>
+      <w:r>
+        <w:t>device</w:t>
+      </w:r>
+      <w:proofErr w:type="gramEnd"/>
+      <w:r>
+        <w:t>_serial</w:t>
+      </w:r>
+      <w:proofErr w:type="spellEnd"/>
+      <w:r>
+        <w:t>": "2RL19T3",</w:t>
+      </w:r>
+    </w:p>
+    <w:p>
+      <w:r>
+        <w:t>            "</w:t>
+      </w:r>
+      <w:proofErr w:type="spellStart"/>
+      <w:proofErr w:type="gramStart"/>
+      <w:r>
+        <w:t>warranty</w:t>
+      </w:r>
+      <w:proofErr w:type="gramEnd"/>
+      <w:r>
+        <w:t>_date</w:t>
+      </w:r>
+      <w:proofErr w:type="spellEnd"/>
+      <w:r>
+        <w:t>": </w:t>
       </w:r>
       <w:r>
         <w:rPr>
@@ -2537,7 +4063,20 @@
     </w:p>
     <w:p>
       <w:r>
-        <w:t>            "created_at": "2026-04-22 11:59:19+06"</w:t>
+        <w:t>            "</w:t>
+      </w:r>
+      <w:proofErr w:type="spellStart"/>
+      <w:proofErr w:type="gramStart"/>
+      <w:r>
+        <w:t>created</w:t>
+      </w:r>
+      <w:proofErr w:type="gramEnd"/>
+      <w:r>
+        <w:t>_at</w:t>
+      </w:r>
+      <w:proofErr w:type="spellEnd"/>
+      <w:r>
+        <w:t>": "2026-04-22 11:59:19+06"</w:t>
       </w:r>
     </w:p>
     <w:p>
@@ -2578,7 +4117,20 @@
     </w:p>
     <w:p>
       <w:r>
-        <w:t>            "emp_id": </w:t>
+        <w:t>            "</w:t>
+      </w:r>
+      <w:proofErr w:type="spellStart"/>
+      <w:proofErr w:type="gramStart"/>
+      <w:r>
+        <w:t>emp</w:t>
+      </w:r>
+      <w:proofErr w:type="gramEnd"/>
+      <w:r>
+        <w:t>_id</w:t>
+      </w:r>
+      <w:proofErr w:type="spellEnd"/>
+      <w:r>
+        <w:t>": </w:t>
       </w:r>
       <w:r>
         <w:rPr>
@@ -2658,12 +4210,38 @@
     </w:p>
     <w:p>
       <w:r>
-        <w:t>            "device_serial": "BK719T3",</w:t>
-      </w:r>
-    </w:p>
-    <w:p>
-      <w:r>
-        <w:t>            "warranty_date": </w:t>
+        <w:t>            "</w:t>
+      </w:r>
+      <w:proofErr w:type="spellStart"/>
+      <w:proofErr w:type="gramStart"/>
+      <w:r>
+        <w:t>device</w:t>
+      </w:r>
+      <w:proofErr w:type="gramEnd"/>
+      <w:r>
+        <w:t>_serial</w:t>
+      </w:r>
+      <w:proofErr w:type="spellEnd"/>
+      <w:r>
+        <w:t>": "BK719T3",</w:t>
+      </w:r>
+    </w:p>
+    <w:p>
+      <w:r>
+        <w:t>            "</w:t>
+      </w:r>
+      <w:proofErr w:type="spellStart"/>
+      <w:proofErr w:type="gramStart"/>
+      <w:r>
+        <w:t>warranty</w:t>
+      </w:r>
+      <w:proofErr w:type="gramEnd"/>
+      <w:r>
+        <w:t>_date</w:t>
+      </w:r>
+      <w:proofErr w:type="spellEnd"/>
+      <w:r>
+        <w:t>": </w:t>
       </w:r>
       <w:r>
         <w:rPr>
@@ -2693,7 +4271,20 @@
     </w:p>
     <w:p>
       <w:r>
-        <w:t>            "created_at": "2026-04-19 12:24:17+06"</w:t>
+        <w:t>            "</w:t>
+      </w:r>
+      <w:proofErr w:type="spellStart"/>
+      <w:proofErr w:type="gramStart"/>
+      <w:r>
+        <w:t>created</w:t>
+      </w:r>
+      <w:proofErr w:type="gramEnd"/>
+      <w:r>
+        <w:t>_at</w:t>
+      </w:r>
+      <w:proofErr w:type="spellEnd"/>
+      <w:r>
+        <w:t>": "2026-04-19 12:24:17+06"</w:t>
       </w:r>
     </w:p>
     <w:p>
@@ -2733,7 +4324,20 @@
     </w:p>
     <w:p>
       <w:r>
-        <w:t>            "emp_id": </w:t>
+        <w:t>            "</w:t>
+      </w:r>
+      <w:proofErr w:type="spellStart"/>
+      <w:proofErr w:type="gramStart"/>
+      <w:r>
+        <w:t>emp</w:t>
+      </w:r>
+      <w:proofErr w:type="gramEnd"/>
+      <w:r>
+        <w:t>_id</w:t>
+      </w:r>
+      <w:proofErr w:type="spellEnd"/>
+      <w:r>
+        <w:t>": </w:t>
       </w:r>
       <w:r>
         <w:rPr>
@@ -2813,13 +4417,39 @@
     </w:p>
     <w:p>
       <w:r>
-        <w:t>            "device_serial": "23Z1HJ3",</w:t>
+        <w:t>            "</w:t>
+      </w:r>
+      <w:proofErr w:type="spellStart"/>
+      <w:proofErr w:type="gramStart"/>
+      <w:r>
+        <w:t>device</w:t>
+      </w:r>
+      <w:proofErr w:type="gramEnd"/>
+      <w:r>
+        <w:t>_serial</w:t>
+      </w:r>
+      <w:proofErr w:type="spellEnd"/>
+      <w:r>
+        <w:t>": "23Z1HJ3",</w:t>
       </w:r>
     </w:p>
     <w:p>
       <w:r>
         <w:lastRenderedPageBreak/>
-        <w:t>            "warranty_date": </w:t>
+        <w:t>            "</w:t>
+      </w:r>
+      <w:proofErr w:type="spellStart"/>
+      <w:proofErr w:type="gramStart"/>
+      <w:r>
+        <w:t>warranty</w:t>
+      </w:r>
+      <w:proofErr w:type="gramEnd"/>
+      <w:r>
+        <w:t>_date</w:t>
+      </w:r>
+      <w:proofErr w:type="spellEnd"/>
+      <w:r>
+        <w:t>": </w:t>
       </w:r>
       <w:r>
         <w:rPr>
@@ -2839,7 +4469,15 @@
     </w:p>
     <w:p>
       <w:r>
-        <w:t>            "vendor": "IT Solutations",</w:t>
+        <w:t>            "vendor": "IT </w:t>
+      </w:r>
+      <w:proofErr w:type="spellStart"/>
+      <w:r>
+        <w:t>Solutations</w:t>
+      </w:r>
+      <w:proofErr w:type="spellEnd"/>
+      <w:r>
+        <w:t>",</w:t>
       </w:r>
     </w:p>
     <w:p>
@@ -2849,7 +4487,20 @@
     </w:p>
     <w:p>
       <w:r>
-        <w:t>            "created_at": "2026-04-01 14:01:39+06"</w:t>
+        <w:t>            "</w:t>
+      </w:r>
+      <w:proofErr w:type="spellStart"/>
+      <w:proofErr w:type="gramStart"/>
+      <w:r>
+        <w:t>created</w:t>
+      </w:r>
+      <w:proofErr w:type="gramEnd"/>
+      <w:r>
+        <w:t>_at</w:t>
+      </w:r>
+      <w:proofErr w:type="spellEnd"/>
+      <w:r>
+        <w:t>": "2026-04-01 14:01:39+06"</w:t>
       </w:r>
     </w:p>
     <w:p>
@@ -2889,7 +4540,20 @@
     </w:p>
     <w:p>
       <w:r>
-        <w:t>            "emp_id": </w:t>
+        <w:t>            "</w:t>
+      </w:r>
+      <w:proofErr w:type="spellStart"/>
+      <w:proofErr w:type="gramStart"/>
+      <w:r>
+        <w:t>emp</w:t>
+      </w:r>
+      <w:proofErr w:type="gramEnd"/>
+      <w:r>
+        <w:t>_id</w:t>
+      </w:r>
+      <w:proofErr w:type="spellEnd"/>
+      <w:r>
+        <w:t>": </w:t>
       </w:r>
       <w:r>
         <w:rPr>
@@ -2969,12 +4633,33 @@
     </w:p>
     <w:p>
       <w:r>
-        <w:t>            "device_serial": "C5BLDHL041025016       M- 25361B009098",</w:t>
-      </w:r>
-    </w:p>
-    <w:p>
-      <w:r>
-        <w:t>            "warranty_date": </w:t>
+        <w:t>            "</w:t>
+      </w:r>
+      <w:proofErr w:type="gramStart"/>
+      <w:r>
+        <w:t>device</w:t>
+      </w:r>
+      <w:proofErr w:type="gramEnd"/>
+      <w:r>
+        <w:t>_serial": "C5BLDHL041025016       M- 25361B009098",</w:t>
+      </w:r>
+    </w:p>
+    <w:p>
+      <w:r>
+        <w:t>            "</w:t>
+      </w:r>
+      <w:proofErr w:type="spellStart"/>
+      <w:proofErr w:type="gramStart"/>
+      <w:r>
+        <w:t>warranty</w:t>
+      </w:r>
+      <w:proofErr w:type="gramEnd"/>
+      <w:r>
+        <w:t>_date</w:t>
+      </w:r>
+      <w:proofErr w:type="spellEnd"/>
+      <w:r>
+        <w:t>": </w:t>
       </w:r>
       <w:r>
         <w:rPr>
@@ -2999,12 +4684,33 @@
     </w:p>
     <w:p>
       <w:r>
-        <w:t>            "problems": "No power\r\n(Gaming Desktop)",</w:t>
-      </w:r>
-    </w:p>
-    <w:p>
-      <w:r>
-        <w:t>            "created_at": "2026-03-15 15:03:09+06"</w:t>
+        <w:t>            "problems": "No power</w:t>
+      </w:r>
+      <w:proofErr w:type="gramStart"/>
+      <w:r>
+        <w:t>\r\n(</w:t>
+      </w:r>
+      <w:proofErr w:type="gramEnd"/>
+      <w:r>
+        <w:t>Gaming Desktop)",</w:t>
+      </w:r>
+    </w:p>
+    <w:p>
+      <w:r>
+        <w:t>            "</w:t>
+      </w:r>
+      <w:proofErr w:type="spellStart"/>
+      <w:proofErr w:type="gramStart"/>
+      <w:r>
+        <w:t>created</w:t>
+      </w:r>
+      <w:proofErr w:type="gramEnd"/>
+      <w:r>
+        <w:t>_at</w:t>
+      </w:r>
+      <w:proofErr w:type="spellEnd"/>
+      <w:r>
+        <w:t>": "2026-03-15 15:03:09+06"</w:t>
       </w:r>
     </w:p>
     <w:p>
@@ -3045,7 +4751,20 @@
     </w:p>
     <w:p>
       <w:r>
-        <w:t>            "emp_id": </w:t>
+        <w:t>            "</w:t>
+      </w:r>
+      <w:proofErr w:type="spellStart"/>
+      <w:proofErr w:type="gramStart"/>
+      <w:r>
+        <w:t>emp</w:t>
+      </w:r>
+      <w:proofErr w:type="gramEnd"/>
+      <w:r>
+        <w:t>_id</w:t>
+      </w:r>
+      <w:proofErr w:type="spellEnd"/>
+      <w:r>
+        <w:t>": </w:t>
       </w:r>
       <w:r>
         <w:rPr>
@@ -3125,12 +4844,38 @@
     </w:p>
     <w:p>
       <w:r>
-        <w:t>            "device_serial": "5CD25036WV",</w:t>
-      </w:r>
-    </w:p>
-    <w:p>
-      <w:r>
-        <w:t>            "warranty_date": </w:t>
+        <w:t>            "</w:t>
+      </w:r>
+      <w:proofErr w:type="spellStart"/>
+      <w:proofErr w:type="gramStart"/>
+      <w:r>
+        <w:t>device</w:t>
+      </w:r>
+      <w:proofErr w:type="gramEnd"/>
+      <w:r>
+        <w:t>_serial</w:t>
+      </w:r>
+      <w:proofErr w:type="spellEnd"/>
+      <w:r>
+        <w:t>": "5CD25036WV",</w:t>
+      </w:r>
+    </w:p>
+    <w:p>
+      <w:r>
+        <w:t>            "</w:t>
+      </w:r>
+      <w:proofErr w:type="spellStart"/>
+      <w:proofErr w:type="gramStart"/>
+      <w:r>
+        <w:t>warranty</w:t>
+      </w:r>
+      <w:proofErr w:type="gramEnd"/>
+      <w:r>
+        <w:t>_date</w:t>
+      </w:r>
+      <w:proofErr w:type="spellEnd"/>
+      <w:r>
+        <w:t>": </w:t>
       </w:r>
       <w:r>
         <w:rPr>
@@ -3160,7 +4905,20 @@
     </w:p>
     <w:p>
       <w:r>
-        <w:t>            "created_at": "2026-03-10 11:24:55+06"</w:t>
+        <w:t>            "</w:t>
+      </w:r>
+      <w:proofErr w:type="spellStart"/>
+      <w:proofErr w:type="gramStart"/>
+      <w:r>
+        <w:t>created</w:t>
+      </w:r>
+      <w:proofErr w:type="gramEnd"/>
+      <w:r>
+        <w:t>_at</w:t>
+      </w:r>
+      <w:proofErr w:type="spellEnd"/>
+      <w:r>
+        <w:t>": "2026-03-10 11:24:55+06"</w:t>
       </w:r>
     </w:p>
     <w:p>
@@ -3200,7 +4958,20 @@
     </w:p>
     <w:p>
       <w:r>
-        <w:t>            "emp_id": </w:t>
+        <w:t>            "</w:t>
+      </w:r>
+      <w:proofErr w:type="spellStart"/>
+      <w:proofErr w:type="gramStart"/>
+      <w:r>
+        <w:t>emp</w:t>
+      </w:r>
+      <w:proofErr w:type="gramEnd"/>
+      <w:r>
+        <w:t>_id</w:t>
+      </w:r>
+      <w:proofErr w:type="spellEnd"/>
+      <w:r>
+        <w:t>": </w:t>
       </w:r>
       <w:r>
         <w:rPr>
@@ -3280,12 +5051,38 @@
     </w:p>
     <w:p>
       <w:r>
-        <w:t>            "device_serial": "FL719T3",</w:t>
-      </w:r>
-    </w:p>
-    <w:p>
-      <w:r>
-        <w:t>            "warranty_date": </w:t>
+        <w:t>            "</w:t>
+      </w:r>
+      <w:proofErr w:type="spellStart"/>
+      <w:proofErr w:type="gramStart"/>
+      <w:r>
+        <w:t>device</w:t>
+      </w:r>
+      <w:proofErr w:type="gramEnd"/>
+      <w:r>
+        <w:t>_serial</w:t>
+      </w:r>
+      <w:proofErr w:type="spellEnd"/>
+      <w:r>
+        <w:t>": "FL719T3",</w:t>
+      </w:r>
+    </w:p>
+    <w:p>
+      <w:r>
+        <w:t>            "</w:t>
+      </w:r>
+      <w:proofErr w:type="spellStart"/>
+      <w:proofErr w:type="gramStart"/>
+      <w:r>
+        <w:t>warranty</w:t>
+      </w:r>
+      <w:proofErr w:type="gramEnd"/>
+      <w:r>
+        <w:t>_date</w:t>
+      </w:r>
+      <w:proofErr w:type="spellEnd"/>
+      <w:r>
+        <w:t>": </w:t>
       </w:r>
       <w:r>
         <w:rPr>
@@ -3316,7 +5113,20 @@
     </w:p>
     <w:p>
       <w:r>
-        <w:t>            "created_at": "2026-03-10 11:23:52+06"</w:t>
+        <w:t>            "</w:t>
+      </w:r>
+      <w:proofErr w:type="spellStart"/>
+      <w:proofErr w:type="gramStart"/>
+      <w:r>
+        <w:t>created</w:t>
+      </w:r>
+      <w:proofErr w:type="gramEnd"/>
+      <w:r>
+        <w:t>_at</w:t>
+      </w:r>
+      <w:proofErr w:type="spellEnd"/>
+      <w:r>
+        <w:t>": "2026-03-10 11:23:52+06"</w:t>
       </w:r>
     </w:p>
     <w:p>
@@ -3356,7 +5166,20 @@
     </w:p>
     <w:p>
       <w:r>
-        <w:t>            "emp_id": </w:t>
+        <w:t>            "</w:t>
+      </w:r>
+      <w:proofErr w:type="spellStart"/>
+      <w:proofErr w:type="gramStart"/>
+      <w:r>
+        <w:t>emp</w:t>
+      </w:r>
+      <w:proofErr w:type="gramEnd"/>
+      <w:r>
+        <w:t>_id</w:t>
+      </w:r>
+      <w:proofErr w:type="spellEnd"/>
+      <w:r>
+        <w:t>": </w:t>
       </w:r>
       <w:r>
         <w:rPr>
@@ -3436,12 +5259,38 @@
     </w:p>
     <w:p>
       <w:r>
-        <w:t>            "device_serial": "5CD201K54X",</w:t>
-      </w:r>
-    </w:p>
-    <w:p>
-      <w:r>
-        <w:t>            "warranty_date": </w:t>
+        <w:t>            "</w:t>
+      </w:r>
+      <w:proofErr w:type="spellStart"/>
+      <w:proofErr w:type="gramStart"/>
+      <w:r>
+        <w:t>device</w:t>
+      </w:r>
+      <w:proofErr w:type="gramEnd"/>
+      <w:r>
+        <w:t>_serial</w:t>
+      </w:r>
+      <w:proofErr w:type="spellEnd"/>
+      <w:r>
+        <w:t>": "5CD201K54X",</w:t>
+      </w:r>
+    </w:p>
+    <w:p>
+      <w:r>
+        <w:t>            "</w:t>
+      </w:r>
+      <w:proofErr w:type="spellStart"/>
+      <w:proofErr w:type="gramStart"/>
+      <w:r>
+        <w:t>warranty</w:t>
+      </w:r>
+      <w:proofErr w:type="gramEnd"/>
+      <w:r>
+        <w:t>_date</w:t>
+      </w:r>
+      <w:proofErr w:type="spellEnd"/>
+      <w:r>
+        <w:t>": </w:t>
       </w:r>
       <w:r>
         <w:rPr>
@@ -3461,7 +5310,15 @@
     </w:p>
     <w:p>
       <w:r>
-        <w:t>            "vendor": "IT Solutations",</w:t>
+        <w:t>            "vendor": "IT </w:t>
+      </w:r>
+      <w:proofErr w:type="spellStart"/>
+      <w:r>
+        <w:t>Solutations</w:t>
+      </w:r>
+      <w:proofErr w:type="spellEnd"/>
+      <w:r>
+        <w:t>",</w:t>
       </w:r>
     </w:p>
     <w:p>
@@ -3471,7 +5328,20 @@
     </w:p>
     <w:p>
       <w:r>
-        <w:t>            "created_at": "2026-03-10 11:04:01+06"</w:t>
+        <w:t>            "</w:t>
+      </w:r>
+      <w:proofErr w:type="spellStart"/>
+      <w:proofErr w:type="gramStart"/>
+      <w:r>
+        <w:t>created</w:t>
+      </w:r>
+      <w:proofErr w:type="gramEnd"/>
+      <w:r>
+        <w:t>_at</w:t>
+      </w:r>
+      <w:proofErr w:type="spellEnd"/>
+      <w:r>
+        <w:t>": "2026-03-10 11:04:01+06"</w:t>
       </w:r>
     </w:p>
     <w:p>
@@ -3512,7 +5382,20 @@
     <w:p>
       <w:r>
         <w:lastRenderedPageBreak/>
-        <w:t>            "emp_id": </w:t>
+        <w:t>            "</w:t>
+      </w:r>
+      <w:proofErr w:type="spellStart"/>
+      <w:proofErr w:type="gramStart"/>
+      <w:r>
+        <w:t>emp</w:t>
+      </w:r>
+      <w:proofErr w:type="gramEnd"/>
+      <w:r>
+        <w:t>_id</w:t>
+      </w:r>
+      <w:proofErr w:type="spellEnd"/>
+      <w:r>
+        <w:t>": </w:t>
       </w:r>
       <w:r>
         <w:rPr>
@@ -3592,12 +5475,38 @@
     </w:p>
     <w:p>
       <w:r>
-        <w:t>            "device_serial": "BQN0P93",</w:t>
-      </w:r>
-    </w:p>
-    <w:p>
-      <w:r>
-        <w:t>            "warranty_date": </w:t>
+        <w:t>            "</w:t>
+      </w:r>
+      <w:proofErr w:type="spellStart"/>
+      <w:proofErr w:type="gramStart"/>
+      <w:r>
+        <w:t>device</w:t>
+      </w:r>
+      <w:proofErr w:type="gramEnd"/>
+      <w:r>
+        <w:t>_serial</w:t>
+      </w:r>
+      <w:proofErr w:type="spellEnd"/>
+      <w:r>
+        <w:t>": "BQN0P93",</w:t>
+      </w:r>
+    </w:p>
+    <w:p>
+      <w:r>
+        <w:t>            "</w:t>
+      </w:r>
+      <w:proofErr w:type="spellStart"/>
+      <w:proofErr w:type="gramStart"/>
+      <w:r>
+        <w:t>warranty</w:t>
+      </w:r>
+      <w:proofErr w:type="gramEnd"/>
+      <w:r>
+        <w:t>_date</w:t>
+      </w:r>
+      <w:proofErr w:type="spellEnd"/>
+      <w:r>
+        <w:t>": </w:t>
       </w:r>
       <w:r>
         <w:rPr>
@@ -3617,7 +5526,15 @@
     </w:p>
     <w:p>
       <w:r>
-        <w:t>            "vendor": "IT Solutations",</w:t>
+        <w:t>            "vendor": "IT </w:t>
+      </w:r>
+      <w:proofErr w:type="spellStart"/>
+      <w:r>
+        <w:t>Solutations</w:t>
+      </w:r>
+      <w:proofErr w:type="spellEnd"/>
+      <w:r>
+        <w:t>",</w:t>
       </w:r>
     </w:p>
     <w:p>
@@ -3627,7 +5544,20 @@
     </w:p>
     <w:p>
       <w:r>
-        <w:t>            "created_at": "2026-03-10 10:52:00+06"</w:t>
+        <w:t>            "</w:t>
+      </w:r>
+      <w:proofErr w:type="spellStart"/>
+      <w:proofErr w:type="gramStart"/>
+      <w:r>
+        <w:t>created</w:t>
+      </w:r>
+      <w:proofErr w:type="gramEnd"/>
+      <w:r>
+        <w:t>_at</w:t>
+      </w:r>
+      <w:proofErr w:type="spellEnd"/>
+      <w:r>
+        <w:t>": "2026-03-10 10:52:00+06"</w:t>
       </w:r>
     </w:p>
     <w:p>
@@ -3667,7 +5597,20 @@
     </w:p>
     <w:p>
       <w:r>
-        <w:t>            "emp_id": </w:t>
+        <w:t>            "</w:t>
+      </w:r>
+      <w:proofErr w:type="spellStart"/>
+      <w:proofErr w:type="gramStart"/>
+      <w:r>
+        <w:t>emp</w:t>
+      </w:r>
+      <w:proofErr w:type="gramEnd"/>
+      <w:r>
+        <w:t>_id</w:t>
+      </w:r>
+      <w:proofErr w:type="spellEnd"/>
+      <w:r>
+        <w:t>": </w:t>
       </w:r>
       <w:r>
         <w:rPr>
@@ -3747,12 +5690,38 @@
     </w:p>
     <w:p>
       <w:r>
-        <w:t>            "device_serial": "73HJ303",</w:t>
-      </w:r>
-    </w:p>
-    <w:p>
-      <w:r>
-        <w:t>            "warranty_date": </w:t>
+        <w:t>            "</w:t>
+      </w:r>
+      <w:proofErr w:type="spellStart"/>
+      <w:proofErr w:type="gramStart"/>
+      <w:r>
+        <w:t>device</w:t>
+      </w:r>
+      <w:proofErr w:type="gramEnd"/>
+      <w:r>
+        <w:t>_serial</w:t>
+      </w:r>
+      <w:proofErr w:type="spellEnd"/>
+      <w:r>
+        <w:t>": "73HJ303",</w:t>
+      </w:r>
+    </w:p>
+    <w:p>
+      <w:r>
+        <w:t>            "</w:t>
+      </w:r>
+      <w:proofErr w:type="spellStart"/>
+      <w:proofErr w:type="gramStart"/>
+      <w:r>
+        <w:t>warranty</w:t>
+      </w:r>
+      <w:proofErr w:type="gramEnd"/>
+      <w:r>
+        <w:t>_date</w:t>
+      </w:r>
+      <w:proofErr w:type="spellEnd"/>
+      <w:r>
+        <w:t>": </w:t>
       </w:r>
       <w:r>
         <w:rPr>
@@ -3783,7 +5752,20 @@
     </w:p>
     <w:p>
       <w:r>
-        <w:t>            "created_at": "2026-03-08 13:03:07+06"</w:t>
+        <w:t>            "</w:t>
+      </w:r>
+      <w:proofErr w:type="spellStart"/>
+      <w:proofErr w:type="gramStart"/>
+      <w:r>
+        <w:t>created</w:t>
+      </w:r>
+      <w:proofErr w:type="gramEnd"/>
+      <w:r>
+        <w:t>_at</w:t>
+      </w:r>
+      <w:proofErr w:type="spellEnd"/>
+      <w:r>
+        <w:t>": "2026-03-08 13:03:07+06"</w:t>
       </w:r>
     </w:p>
     <w:p>
@@ -3823,7 +5805,20 @@
     </w:p>
     <w:p>
       <w:r>
-        <w:t>            "emp_id": </w:t>
+        <w:t>            "</w:t>
+      </w:r>
+      <w:proofErr w:type="spellStart"/>
+      <w:proofErr w:type="gramStart"/>
+      <w:r>
+        <w:t>emp</w:t>
+      </w:r>
+      <w:proofErr w:type="gramEnd"/>
+      <w:r>
+        <w:t>_id</w:t>
+      </w:r>
+      <w:proofErr w:type="spellEnd"/>
+      <w:r>
+        <w:t>": </w:t>
       </w:r>
       <w:r>
         <w:rPr>
@@ -3903,12 +5898,38 @@
     </w:p>
     <w:p>
       <w:r>
-        <w:t>            "device_serial": "K2202N0108444",</w:t>
-      </w:r>
-    </w:p>
-    <w:p>
-      <w:r>
-        <w:t>            "warranty_date": </w:t>
+        <w:t>            "</w:t>
+      </w:r>
+      <w:proofErr w:type="spellStart"/>
+      <w:proofErr w:type="gramStart"/>
+      <w:r>
+        <w:t>device</w:t>
+      </w:r>
+      <w:proofErr w:type="gramEnd"/>
+      <w:r>
+        <w:t>_serial</w:t>
+      </w:r>
+      <w:proofErr w:type="spellEnd"/>
+      <w:r>
+        <w:t>": "K2202N0108444",</w:t>
+      </w:r>
+    </w:p>
+    <w:p>
+      <w:r>
+        <w:t>            "</w:t>
+      </w:r>
+      <w:proofErr w:type="spellStart"/>
+      <w:proofErr w:type="gramStart"/>
+      <w:r>
+        <w:t>warranty</w:t>
+      </w:r>
+      <w:proofErr w:type="gramEnd"/>
+      <w:r>
+        <w:t>_date</w:t>
+      </w:r>
+      <w:proofErr w:type="spellEnd"/>
+      <w:r>
+        <w:t>": </w:t>
       </w:r>
       <w:r>
         <w:rPr>
@@ -3928,7 +5949,15 @@
     </w:p>
     <w:p>
       <w:r>
-        <w:t>            "vendor": "IT Solutations",</w:t>
+        <w:t>            "vendor": "IT </w:t>
+      </w:r>
+      <w:proofErr w:type="spellStart"/>
+      <w:r>
+        <w:t>Solutations</w:t>
+      </w:r>
+      <w:proofErr w:type="spellEnd"/>
+      <w:r>
+        <w:t>",</w:t>
       </w:r>
     </w:p>
     <w:p>
@@ -3938,7 +5967,20 @@
     </w:p>
     <w:p>
       <w:r>
-        <w:t>            "created_at": "2026-03-08 13:01:05+06"</w:t>
+        <w:t>            "</w:t>
+      </w:r>
+      <w:proofErr w:type="spellStart"/>
+      <w:proofErr w:type="gramStart"/>
+      <w:r>
+        <w:t>created</w:t>
+      </w:r>
+      <w:proofErr w:type="gramEnd"/>
+      <w:r>
+        <w:t>_at</w:t>
+      </w:r>
+      <w:proofErr w:type="spellEnd"/>
+      <w:r>
+        <w:t>": "2026-03-08 13:01:05+06"</w:t>
       </w:r>
     </w:p>
     <w:p>
@@ -3978,7 +6020,20 @@
     </w:p>
     <w:p>
       <w:r>
-        <w:t>            "emp_id": </w:t>
+        <w:t>            "</w:t>
+      </w:r>
+      <w:proofErr w:type="spellStart"/>
+      <w:proofErr w:type="gramStart"/>
+      <w:r>
+        <w:t>emp</w:t>
+      </w:r>
+      <w:proofErr w:type="gramEnd"/>
+      <w:r>
+        <w:t>_id</w:t>
+      </w:r>
+      <w:proofErr w:type="spellEnd"/>
+      <w:r>
+        <w:t>": </w:t>
       </w:r>
       <w:r>
         <w:rPr>
@@ -4059,12 +6114,38 @@
     </w:p>
     <w:p>
       <w:r>
-        <w:t>            "device_serial": "1SF0HJ3",</w:t>
-      </w:r>
-    </w:p>
-    <w:p>
-      <w:r>
-        <w:t>            "warranty_date": </w:t>
+        <w:t>            "</w:t>
+      </w:r>
+      <w:proofErr w:type="spellStart"/>
+      <w:proofErr w:type="gramStart"/>
+      <w:r>
+        <w:t>device</w:t>
+      </w:r>
+      <w:proofErr w:type="gramEnd"/>
+      <w:r>
+        <w:t>_serial</w:t>
+      </w:r>
+      <w:proofErr w:type="spellEnd"/>
+      <w:r>
+        <w:t>": "1SF0HJ3",</w:t>
+      </w:r>
+    </w:p>
+    <w:p>
+      <w:r>
+        <w:t>            "</w:t>
+      </w:r>
+      <w:proofErr w:type="spellStart"/>
+      <w:proofErr w:type="gramStart"/>
+      <w:r>
+        <w:t>warranty</w:t>
+      </w:r>
+      <w:proofErr w:type="gramEnd"/>
+      <w:r>
+        <w:t>_date</w:t>
+      </w:r>
+      <w:proofErr w:type="spellEnd"/>
+      <w:r>
+        <w:t>": </w:t>
       </w:r>
       <w:r>
         <w:rPr>
@@ -4094,7 +6175,20 @@
     </w:p>
     <w:p>
       <w:r>
-        <w:t>            "created_at": "2026-03-08 12:56:13+06"</w:t>
+        <w:t>            "</w:t>
+      </w:r>
+      <w:proofErr w:type="spellStart"/>
+      <w:proofErr w:type="gramStart"/>
+      <w:r>
+        <w:t>created</w:t>
+      </w:r>
+      <w:proofErr w:type="gramEnd"/>
+      <w:r>
+        <w:t>_at</w:t>
+      </w:r>
+      <w:proofErr w:type="spellEnd"/>
+      <w:r>
+        <w:t>": "2026-03-08 12:56:13+06"</w:t>
       </w:r>
     </w:p>
     <w:p>
@@ -4134,7 +6228,20 @@
     </w:p>
     <w:p>
       <w:r>
-        <w:t>            "emp_id": </w:t>
+        <w:t>            "</w:t>
+      </w:r>
+      <w:proofErr w:type="spellStart"/>
+      <w:proofErr w:type="gramStart"/>
+      <w:r>
+        <w:t>emp</w:t>
+      </w:r>
+      <w:proofErr w:type="gramEnd"/>
+      <w:r>
+        <w:t>_id</w:t>
+      </w:r>
+      <w:proofErr w:type="spellEnd"/>
+      <w:r>
+        <w:t>": </w:t>
       </w:r>
       <w:r>
         <w:rPr>
@@ -4214,12 +6321,38 @@
     </w:p>
     <w:p>
       <w:r>
-        <w:t>            "device_serial": "2508APW6YT49",</w:t>
-      </w:r>
-    </w:p>
-    <w:p>
-      <w:r>
-        <w:t>            "warranty_date": </w:t>
+        <w:t>            "</w:t>
+      </w:r>
+      <w:proofErr w:type="spellStart"/>
+      <w:proofErr w:type="gramStart"/>
+      <w:r>
+        <w:t>device</w:t>
+      </w:r>
+      <w:proofErr w:type="gramEnd"/>
+      <w:r>
+        <w:t>_serial</w:t>
+      </w:r>
+      <w:proofErr w:type="spellEnd"/>
+      <w:r>
+        <w:t>": "2508APW6YT49",</w:t>
+      </w:r>
+    </w:p>
+    <w:p>
+      <w:r>
+        <w:t>            "</w:t>
+      </w:r>
+      <w:proofErr w:type="spellStart"/>
+      <w:proofErr w:type="gramStart"/>
+      <w:r>
+        <w:t>warranty</w:t>
+      </w:r>
+      <w:proofErr w:type="gramEnd"/>
+      <w:r>
+        <w:t>_date</w:t>
+      </w:r>
+      <w:proofErr w:type="spellEnd"/>
+      <w:r>
+        <w:t>": </w:t>
       </w:r>
       <w:r>
         <w:rPr>
@@ -4250,7 +6383,20 @@
     </w:p>
     <w:p>
       <w:r>
-        <w:t>            "created_at": "2026-03-03 11:14:11+06"</w:t>
+        <w:t>            "</w:t>
+      </w:r>
+      <w:proofErr w:type="spellStart"/>
+      <w:proofErr w:type="gramStart"/>
+      <w:r>
+        <w:t>created</w:t>
+      </w:r>
+      <w:proofErr w:type="gramEnd"/>
+      <w:r>
+        <w:t>_at</w:t>
+      </w:r>
+      <w:proofErr w:type="spellEnd"/>
+      <w:r>
+        <w:t>": "2026-03-03 11:14:11+06"</w:t>
       </w:r>
     </w:p>
     <w:p>
@@ -4290,7 +6436,20 @@
     </w:p>
     <w:p>
       <w:r>
-        <w:t>            "emp_id": </w:t>
+        <w:t>            "</w:t>
+      </w:r>
+      <w:proofErr w:type="spellStart"/>
+      <w:proofErr w:type="gramStart"/>
+      <w:r>
+        <w:t>emp</w:t>
+      </w:r>
+      <w:proofErr w:type="gramEnd"/>
+      <w:r>
+        <w:t>_id</w:t>
+      </w:r>
+      <w:proofErr w:type="spellEnd"/>
+      <w:r>
+        <w:t>": </w:t>
       </w:r>
       <w:r>
         <w:rPr>
@@ -4370,12 +6529,38 @@
     </w:p>
     <w:p>
       <w:r>
-        <w:t>            "device_serial": "9FTQGH3",</w:t>
-      </w:r>
-    </w:p>
-    <w:p>
-      <w:r>
-        <w:t>            "warranty_date": </w:t>
+        <w:t>            "</w:t>
+      </w:r>
+      <w:proofErr w:type="spellStart"/>
+      <w:proofErr w:type="gramStart"/>
+      <w:r>
+        <w:t>device</w:t>
+      </w:r>
+      <w:proofErr w:type="gramEnd"/>
+      <w:r>
+        <w:t>_serial</w:t>
+      </w:r>
+      <w:proofErr w:type="spellEnd"/>
+      <w:r>
+        <w:t>": "9FTQGH3",</w:t>
+      </w:r>
+    </w:p>
+    <w:p>
+      <w:r>
+        <w:t>            "</w:t>
+      </w:r>
+      <w:proofErr w:type="spellStart"/>
+      <w:proofErr w:type="gramStart"/>
+      <w:r>
+        <w:t>warranty</w:t>
+      </w:r>
+      <w:proofErr w:type="gramEnd"/>
+      <w:r>
+        <w:t>_date</w:t>
+      </w:r>
+      <w:proofErr w:type="spellEnd"/>
+      <w:r>
+        <w:t>": </w:t>
       </w:r>
       <w:r>
         <w:rPr>
@@ -4395,7 +6580,15 @@
     </w:p>
     <w:p>
       <w:r>
-        <w:t>            "vendor": "IT Solutations",</w:t>
+        <w:t>            "vendor": "IT </w:t>
+      </w:r>
+      <w:proofErr w:type="spellStart"/>
+      <w:r>
+        <w:t>Solutations</w:t>
+      </w:r>
+      <w:proofErr w:type="spellEnd"/>
+      <w:r>
+        <w:t>",</w:t>
       </w:r>
     </w:p>
     <w:p>
@@ -4405,7 +6598,20 @@
     </w:p>
     <w:p>
       <w:r>
-        <w:t>            "created_at": "2026-01-27 10:42:46+06"</w:t>
+        <w:t>            "</w:t>
+      </w:r>
+      <w:proofErr w:type="spellStart"/>
+      <w:proofErr w:type="gramStart"/>
+      <w:r>
+        <w:t>created</w:t>
+      </w:r>
+      <w:proofErr w:type="gramEnd"/>
+      <w:r>
+        <w:t>_at</w:t>
+      </w:r>
+      <w:proofErr w:type="spellEnd"/>
+      <w:r>
+        <w:t>": "2026-01-27 10:42:46+06"</w:t>
       </w:r>
     </w:p>
     <w:p>
@@ -4445,7 +6651,20 @@
     </w:p>
     <w:p>
       <w:r>
-        <w:t>            "emp_id": </w:t>
+        <w:t>            "</w:t>
+      </w:r>
+      <w:proofErr w:type="spellStart"/>
+      <w:proofErr w:type="gramStart"/>
+      <w:r>
+        <w:t>emp</w:t>
+      </w:r>
+      <w:proofErr w:type="gramEnd"/>
+      <w:r>
+        <w:t>_id</w:t>
+      </w:r>
+      <w:proofErr w:type="spellEnd"/>
+      <w:r>
+        <w:t>": </w:t>
       </w:r>
       <w:r>
         <w:rPr>
@@ -4526,12 +6745,38 @@
     </w:p>
     <w:p>
       <w:r>
-        <w:t>            "device_serial": "FZD19T3",</w:t>
-      </w:r>
-    </w:p>
-    <w:p>
-      <w:r>
-        <w:t>            "warranty_date": </w:t>
+        <w:t>            "</w:t>
+      </w:r>
+      <w:proofErr w:type="spellStart"/>
+      <w:proofErr w:type="gramStart"/>
+      <w:r>
+        <w:t>device</w:t>
+      </w:r>
+      <w:proofErr w:type="gramEnd"/>
+      <w:r>
+        <w:t>_serial</w:t>
+      </w:r>
+      <w:proofErr w:type="spellEnd"/>
+      <w:r>
+        <w:t>": "FZD19T3",</w:t>
+      </w:r>
+    </w:p>
+    <w:p>
+      <w:r>
+        <w:t>            "</w:t>
+      </w:r>
+      <w:proofErr w:type="spellStart"/>
+      <w:proofErr w:type="gramStart"/>
+      <w:r>
+        <w:t>warranty</w:t>
+      </w:r>
+      <w:proofErr w:type="gramEnd"/>
+      <w:r>
+        <w:t>_date</w:t>
+      </w:r>
+      <w:proofErr w:type="spellEnd"/>
+      <w:r>
+        <w:t>": </w:t>
       </w:r>
       <w:r>
         <w:rPr>
@@ -4556,12 +6801,33 @@
     </w:p>
     <w:p>
       <w:r>
-        <w:t>            "problems": "1. Touch pad with button\r\n2. Keyboard (&lt;&lt;&gt;&gt;&gt;)\r\n2.",</w:t>
-      </w:r>
-    </w:p>
-    <w:p>
-      <w:r>
-        <w:t>            "created_at": "2026-01-26 17:13:18+06"</w:t>
+        <w:t>            "problems": "1. Touch pad with button\r\n2. Keyboard (&lt;&lt;&gt;&gt;</w:t>
+      </w:r>
+      <w:proofErr w:type="gramStart"/>
+      <w:r>
+        <w:t>&gt;)\r\n2</w:t>
+      </w:r>
+      <w:proofErr w:type="gramEnd"/>
+      <w:r>
+        <w:t>.",</w:t>
+      </w:r>
+    </w:p>
+    <w:p>
+      <w:r>
+        <w:t>            "</w:t>
+      </w:r>
+      <w:proofErr w:type="spellStart"/>
+      <w:proofErr w:type="gramStart"/>
+      <w:r>
+        <w:t>created</w:t>
+      </w:r>
+      <w:proofErr w:type="gramEnd"/>
+      <w:r>
+        <w:t>_at</w:t>
+      </w:r>
+      <w:proofErr w:type="spellEnd"/>
+      <w:r>
+        <w:t>": "2026-01-26 17:13:18+06"</w:t>
       </w:r>
     </w:p>
     <w:p>
@@ -4581,7 +6847,20 @@
     </w:p>
     <w:p>
       <w:r>
-        <w:t>    "page_size": 20,</w:t>
+        <w:t>    "</w:t>
+      </w:r>
+      <w:proofErr w:type="spellStart"/>
+      <w:proofErr w:type="gramStart"/>
+      <w:r>
+        <w:t>page</w:t>
+      </w:r>
+      <w:proofErr w:type="gramEnd"/>
+      <w:r>
+        <w:t>_size</w:t>
+      </w:r>
+      <w:proofErr w:type="spellEnd"/>
+      <w:r>
+        <w:t>": 20,</w:t>
       </w:r>
     </w:p>
     <w:p>
@@ -4620,11 +6899,29 @@
     <w:p/>
     <w:p/>
     <w:p>
-      <w:r>
-        <w:t xml:space="preserve">Postman : </w:t>
-      </w:r>
-      <w:r>
-        <w:t xml:space="preserve">Method : GET : </w:t>
+      <w:proofErr w:type="gramStart"/>
+      <w:r>
+        <w:t>Postman :</w:t>
+      </w:r>
+      <w:proofErr w:type="gramEnd"/>
+      <w:r>
+        <w:t xml:space="preserve"> </w:t>
+      </w:r>
+      <w:proofErr w:type="gramStart"/>
+      <w:r>
+        <w:t>Method :</w:t>
+      </w:r>
+      <w:proofErr w:type="gramEnd"/>
+      <w:r>
+        <w:t xml:space="preserve"> </w:t>
+      </w:r>
+      <w:proofErr w:type="gramStart"/>
+      <w:r>
+        <w:t>GET :</w:t>
+      </w:r>
+      <w:proofErr w:type="gramEnd"/>
+      <w:r>
+        <w:t xml:space="preserve"> </w:t>
       </w:r>
       <w:hyperlink r:id="rId19" w:history="1">
         <w:r>
@@ -4637,7 +6934,15 @@
     </w:p>
     <w:p>
       <w:r>
-        <w:t xml:space="preserve">Local Brower : </w:t>
+        <w:t xml:space="preserve">Local </w:t>
+      </w:r>
+      <w:proofErr w:type="gramStart"/>
+      <w:r>
+        <w:t>Brower :</w:t>
+      </w:r>
+      <w:proofErr w:type="gramEnd"/>
+      <w:r>
+        <w:t xml:space="preserve"> </w:t>
       </w:r>
       <w:r>
         <w:t>http://localhost:5173/dashboard/service-warranty/warranty-claims?status=Expired</w:t>
@@ -4716,7 +7021,20 @@
     </w:p>
     <w:p>
       <w:r>
-        <w:t>            "emp_id": "02-2004",</w:t>
+        <w:t>            "</w:t>
+      </w:r>
+      <w:proofErr w:type="spellStart"/>
+      <w:proofErr w:type="gramStart"/>
+      <w:r>
+        <w:t>emp</w:t>
+      </w:r>
+      <w:proofErr w:type="gramEnd"/>
+      <w:r>
+        <w:t>_id</w:t>
+      </w:r>
+      <w:proofErr w:type="spellEnd"/>
+      <w:r>
+        <w:t>": "02-2004",</w:t>
       </w:r>
     </w:p>
     <w:p>
@@ -4757,12 +7075,38 @@
     </w:p>
     <w:p>
       <w:r>
-        <w:t>            "device_serial": "20260411n0sn",</w:t>
-      </w:r>
-    </w:p>
-    <w:p>
-      <w:r>
-        <w:t>            "warranty_date": "2026-07-11 19:52:32+06",</w:t>
+        <w:t>            "</w:t>
+      </w:r>
+      <w:proofErr w:type="spellStart"/>
+      <w:proofErr w:type="gramStart"/>
+      <w:r>
+        <w:t>device</w:t>
+      </w:r>
+      <w:proofErr w:type="gramEnd"/>
+      <w:r>
+        <w:t>_serial</w:t>
+      </w:r>
+      <w:proofErr w:type="spellEnd"/>
+      <w:r>
+        <w:t>": "20260411n0sn",</w:t>
+      </w:r>
+    </w:p>
+    <w:p>
+      <w:r>
+        <w:t>            "</w:t>
+      </w:r>
+      <w:proofErr w:type="spellStart"/>
+      <w:proofErr w:type="gramStart"/>
+      <w:r>
+        <w:t>warranty</w:t>
+      </w:r>
+      <w:proofErr w:type="gramEnd"/>
+      <w:r>
+        <w:t>_date</w:t>
+      </w:r>
+      <w:proofErr w:type="spellEnd"/>
+      <w:r>
+        <w:t>": "2026-07-11 19:52:32+06",</w:t>
       </w:r>
     </w:p>
     <w:p>
@@ -4792,7 +7136,20 @@
     </w:p>
     <w:p>
       <w:r>
-        <w:t>            "created_at": "2026-07-11 19:52:32+06"</w:t>
+        <w:t>            "</w:t>
+      </w:r>
+      <w:proofErr w:type="spellStart"/>
+      <w:proofErr w:type="gramStart"/>
+      <w:r>
+        <w:t>created</w:t>
+      </w:r>
+      <w:proofErr w:type="gramEnd"/>
+      <w:r>
+        <w:t>_at</w:t>
+      </w:r>
+      <w:proofErr w:type="spellEnd"/>
+      <w:r>
+        <w:t>": "2026-07-11 19:52:32+06"</w:t>
       </w:r>
     </w:p>
     <w:p>
@@ -4817,12 +7174,33 @@
     </w:p>
     <w:p>
       <w:r>
-        <w:t>            "employee": "Md. Moniruzzaman",</w:t>
-      </w:r>
-    </w:p>
-    <w:p>
-      <w:r>
-        <w:t>            "emp_id": "02-1824",</w:t>
+        <w:t>            "employee": "Md. </w:t>
+      </w:r>
+      <w:proofErr w:type="spellStart"/>
+      <w:r>
+        <w:t>Moniruzzaman</w:t>
+      </w:r>
+      <w:proofErr w:type="spellEnd"/>
+      <w:r>
+        <w:t>",</w:t>
+      </w:r>
+    </w:p>
+    <w:p>
+      <w:r>
+        <w:t>            "</w:t>
+      </w:r>
+      <w:proofErr w:type="spellStart"/>
+      <w:proofErr w:type="gramStart"/>
+      <w:r>
+        <w:t>emp</w:t>
+      </w:r>
+      <w:proofErr w:type="gramEnd"/>
+      <w:r>
+        <w:t>_id</w:t>
+      </w:r>
+      <w:proofErr w:type="spellEnd"/>
+      <w:r>
+        <w:t>": "02-1824",</w:t>
       </w:r>
     </w:p>
     <w:p>
@@ -4852,12 +7230,38 @@
     </w:p>
     <w:p>
       <w:r>
-        <w:t>            "device_serial": "CQL19T3",</w:t>
-      </w:r>
-    </w:p>
-    <w:p>
-      <w:r>
-        <w:t>            "warranty_date": "2026-07-06 15:31:03+06",</w:t>
+        <w:t>            "</w:t>
+      </w:r>
+      <w:proofErr w:type="spellStart"/>
+      <w:proofErr w:type="gramStart"/>
+      <w:r>
+        <w:t>device</w:t>
+      </w:r>
+      <w:proofErr w:type="gramEnd"/>
+      <w:r>
+        <w:t>_serial</w:t>
+      </w:r>
+      <w:proofErr w:type="spellEnd"/>
+      <w:r>
+        <w:t>": "CQL19T3",</w:t>
+      </w:r>
+    </w:p>
+    <w:p>
+      <w:r>
+        <w:t>            "</w:t>
+      </w:r>
+      <w:proofErr w:type="spellStart"/>
+      <w:proofErr w:type="gramStart"/>
+      <w:r>
+        <w:t>warranty</w:t>
+      </w:r>
+      <w:proofErr w:type="gramEnd"/>
+      <w:r>
+        <w:t>_date</w:t>
+      </w:r>
+      <w:proofErr w:type="spellEnd"/>
+      <w:r>
+        <w:t>": "2026-07-06 15:31:03+06",</w:t>
       </w:r>
     </w:p>
     <w:p>
@@ -4887,7 +7291,20 @@
     </w:p>
     <w:p>
       <w:r>
-        <w:t>            "created_at": "2026-07-06 15:31:03+06"</w:t>
+        <w:t>            "</w:t>
+      </w:r>
+      <w:proofErr w:type="spellStart"/>
+      <w:proofErr w:type="gramStart"/>
+      <w:r>
+        <w:t>created</w:t>
+      </w:r>
+      <w:proofErr w:type="gramEnd"/>
+      <w:r>
+        <w:t>_at</w:t>
+      </w:r>
+      <w:proofErr w:type="spellEnd"/>
+      <w:r>
+        <w:t>": "2026-07-06 15:31:03+06"</w:t>
       </w:r>
     </w:p>
     <w:p>
@@ -4918,7 +7335,20 @@
     </w:p>
     <w:p>
       <w:r>
-        <w:t>            "emp_id": "02-2625",</w:t>
+        <w:t>            "</w:t>
+      </w:r>
+      <w:proofErr w:type="spellStart"/>
+      <w:proofErr w:type="gramStart"/>
+      <w:r>
+        <w:t>emp</w:t>
+      </w:r>
+      <w:proofErr w:type="gramEnd"/>
+      <w:r>
+        <w:t>_id</w:t>
+      </w:r>
+      <w:proofErr w:type="spellEnd"/>
+      <w:r>
+        <w:t>": "02-2625",</w:t>
       </w:r>
     </w:p>
     <w:p>
@@ -4948,12 +7378,38 @@
     </w:p>
     <w:p>
       <w:r>
-        <w:t>            "device_serial": "P/N: 70694",</w:t>
-      </w:r>
-    </w:p>
-    <w:p>
-      <w:r>
-        <w:t>            "warranty_date": "2026-06-26 11:27:44+06",</w:t>
+        <w:t>            "</w:t>
+      </w:r>
+      <w:proofErr w:type="spellStart"/>
+      <w:proofErr w:type="gramStart"/>
+      <w:r>
+        <w:t>device</w:t>
+      </w:r>
+      <w:proofErr w:type="gramEnd"/>
+      <w:r>
+        <w:t>_serial</w:t>
+      </w:r>
+      <w:proofErr w:type="spellEnd"/>
+      <w:r>
+        <w:t>": "P/N: 70694",</w:t>
+      </w:r>
+    </w:p>
+    <w:p>
+      <w:r>
+        <w:t>            "</w:t>
+      </w:r>
+      <w:proofErr w:type="spellStart"/>
+      <w:proofErr w:type="gramStart"/>
+      <w:r>
+        <w:t>warranty</w:t>
+      </w:r>
+      <w:proofErr w:type="gramEnd"/>
+      <w:r>
+        <w:t>_date</w:t>
+      </w:r>
+      <w:proofErr w:type="spellEnd"/>
+      <w:r>
+        <w:t>": "2026-06-26 11:27:44+06",</w:t>
       </w:r>
     </w:p>
     <w:p>
@@ -4983,7 +7439,20 @@
     </w:p>
     <w:p>
       <w:r>
-        <w:t>            "created_at": "2026-06-26 11:27:44+06"</w:t>
+        <w:t>            "</w:t>
+      </w:r>
+      <w:proofErr w:type="spellStart"/>
+      <w:proofErr w:type="gramStart"/>
+      <w:r>
+        <w:t>created</w:t>
+      </w:r>
+      <w:proofErr w:type="gramEnd"/>
+      <w:r>
+        <w:t>_at</w:t>
+      </w:r>
+      <w:proofErr w:type="spellEnd"/>
+      <w:r>
+        <w:t>": "2026-06-26 11:27:44+06"</w:t>
       </w:r>
     </w:p>
     <w:p>
@@ -5013,7 +7482,20 @@
     </w:p>
     <w:p>
       <w:r>
-        <w:t>            "emp_id": "02-2718",</w:t>
+        <w:t>            "</w:t>
+      </w:r>
+      <w:proofErr w:type="spellStart"/>
+      <w:proofErr w:type="gramStart"/>
+      <w:r>
+        <w:t>emp</w:t>
+      </w:r>
+      <w:proofErr w:type="gramEnd"/>
+      <w:r>
+        <w:t>_id</w:t>
+      </w:r>
+      <w:proofErr w:type="spellEnd"/>
+      <w:r>
+        <w:t>": "02-2718",</w:t>
       </w:r>
     </w:p>
     <w:p>
@@ -5044,12 +7526,38 @@
     </w:p>
     <w:p>
       <w:r>
-        <w:t>            "device_serial": "2227LZX1PRC8",</w:t>
-      </w:r>
-    </w:p>
-    <w:p>
-      <w:r>
-        <w:t>            "warranty_date": "2026-06-16 16:37:23+06",</w:t>
+        <w:t>            "</w:t>
+      </w:r>
+      <w:proofErr w:type="spellStart"/>
+      <w:proofErr w:type="gramStart"/>
+      <w:r>
+        <w:t>device</w:t>
+      </w:r>
+      <w:proofErr w:type="gramEnd"/>
+      <w:r>
+        <w:t>_serial</w:t>
+      </w:r>
+      <w:proofErr w:type="spellEnd"/>
+      <w:r>
+        <w:t>": "2227LZX1PRC8",</w:t>
+      </w:r>
+    </w:p>
+    <w:p>
+      <w:r>
+        <w:t>            "</w:t>
+      </w:r>
+      <w:proofErr w:type="spellStart"/>
+      <w:proofErr w:type="gramStart"/>
+      <w:r>
+        <w:t>warranty</w:t>
+      </w:r>
+      <w:proofErr w:type="gramEnd"/>
+      <w:r>
+        <w:t>_date</w:t>
+      </w:r>
+      <w:proofErr w:type="spellEnd"/>
+      <w:r>
+        <w:t>": "2026-06-16 16:37:23+06",</w:t>
       </w:r>
     </w:p>
     <w:p>
@@ -5079,7 +7587,20 @@
     </w:p>
     <w:p>
       <w:r>
-        <w:t>            "created_at": "2026-06-16 16:37:23+06"</w:t>
+        <w:t>            "</w:t>
+      </w:r>
+      <w:proofErr w:type="spellStart"/>
+      <w:proofErr w:type="gramStart"/>
+      <w:r>
+        <w:t>created</w:t>
+      </w:r>
+      <w:proofErr w:type="gramEnd"/>
+      <w:r>
+        <w:t>_at</w:t>
+      </w:r>
+      <w:proofErr w:type="spellEnd"/>
+      <w:r>
+        <w:t>": "2026-06-16 16:37:23+06"</w:t>
       </w:r>
     </w:p>
     <w:p>
@@ -5109,7 +7630,20 @@
     </w:p>
     <w:p>
       <w:r>
-        <w:t>            "emp_id": "02-2720",</w:t>
+        <w:t>            "</w:t>
+      </w:r>
+      <w:proofErr w:type="spellStart"/>
+      <w:proofErr w:type="gramStart"/>
+      <w:r>
+        <w:t>emp</w:t>
+      </w:r>
+      <w:proofErr w:type="gramEnd"/>
+      <w:r>
+        <w:t>_id</w:t>
+      </w:r>
+      <w:proofErr w:type="spellEnd"/>
+      <w:r>
+        <w:t>": "02-2720",</w:t>
       </w:r>
     </w:p>
     <w:p>
@@ -5149,12 +7683,38 @@
     </w:p>
     <w:p>
       <w:r>
-        <w:t>            "device_serial": "2508APM71V78",</w:t>
-      </w:r>
-    </w:p>
-    <w:p>
-      <w:r>
-        <w:t>            "warranty_date": "2026-06-16 11:09:19+06",</w:t>
+        <w:t>            "</w:t>
+      </w:r>
+      <w:proofErr w:type="spellStart"/>
+      <w:proofErr w:type="gramStart"/>
+      <w:r>
+        <w:t>device</w:t>
+      </w:r>
+      <w:proofErr w:type="gramEnd"/>
+      <w:r>
+        <w:t>_serial</w:t>
+      </w:r>
+      <w:proofErr w:type="spellEnd"/>
+      <w:r>
+        <w:t>": "2508APM71V78",</w:t>
+      </w:r>
+    </w:p>
+    <w:p>
+      <w:r>
+        <w:t>            "</w:t>
+      </w:r>
+      <w:proofErr w:type="spellStart"/>
+      <w:proofErr w:type="gramStart"/>
+      <w:r>
+        <w:t>warranty</w:t>
+      </w:r>
+      <w:proofErr w:type="gramEnd"/>
+      <w:r>
+        <w:t>_date</w:t>
+      </w:r>
+      <w:proofErr w:type="spellEnd"/>
+      <w:r>
+        <w:t>": "2026-06-16 11:09:19+06",</w:t>
       </w:r>
     </w:p>
     <w:p>
@@ -5184,7 +7744,20 @@
     </w:p>
     <w:p>
       <w:r>
-        <w:t>            "created_at": "2026-06-16 11:09:19+06"</w:t>
+        <w:t>            "</w:t>
+      </w:r>
+      <w:proofErr w:type="spellStart"/>
+      <w:proofErr w:type="gramStart"/>
+      <w:r>
+        <w:t>created</w:t>
+      </w:r>
+      <w:proofErr w:type="gramEnd"/>
+      <w:r>
+        <w:t>_at</w:t>
+      </w:r>
+      <w:proofErr w:type="spellEnd"/>
+      <w:r>
+        <w:t>": "2026-06-16 11:09:19+06"</w:t>
       </w:r>
     </w:p>
     <w:p>
@@ -5210,12 +7783,33 @@
     </w:p>
     <w:p>
       <w:r>
-        <w:t>            "employee": "Md. Asrafuzzaman",</w:t>
-      </w:r>
-    </w:p>
-    <w:p>
-      <w:r>
-        <w:t>            "emp_id": "02-2707",</w:t>
+        <w:t>            "employee": "Md. </w:t>
+      </w:r>
+      <w:proofErr w:type="spellStart"/>
+      <w:r>
+        <w:t>Asrafuzzaman</w:t>
+      </w:r>
+      <w:proofErr w:type="spellEnd"/>
+      <w:r>
+        <w:t>",</w:t>
+      </w:r>
+    </w:p>
+    <w:p>
+      <w:r>
+        <w:t>            "</w:t>
+      </w:r>
+      <w:proofErr w:type="spellStart"/>
+      <w:proofErr w:type="gramStart"/>
+      <w:r>
+        <w:t>emp</w:t>
+      </w:r>
+      <w:proofErr w:type="gramEnd"/>
+      <w:r>
+        <w:t>_id</w:t>
+      </w:r>
+      <w:proofErr w:type="spellEnd"/>
+      <w:r>
+        <w:t>": "02-2707",</w:t>
       </w:r>
     </w:p>
     <w:p>
@@ -5255,12 +7849,38 @@
     </w:p>
     <w:p>
       <w:r>
-        <w:t>            "device_serial": "2508AP3748U8",</w:t>
-      </w:r>
-    </w:p>
-    <w:p>
-      <w:r>
-        <w:t>            "warranty_date": "2026-06-16 11:09:19+06",</w:t>
+        <w:t>            "</w:t>
+      </w:r>
+      <w:proofErr w:type="spellStart"/>
+      <w:proofErr w:type="gramStart"/>
+      <w:r>
+        <w:t>device</w:t>
+      </w:r>
+      <w:proofErr w:type="gramEnd"/>
+      <w:r>
+        <w:t>_serial</w:t>
+      </w:r>
+      <w:proofErr w:type="spellEnd"/>
+      <w:r>
+        <w:t>": "2508AP3748U8",</w:t>
+      </w:r>
+    </w:p>
+    <w:p>
+      <w:r>
+        <w:t>            "</w:t>
+      </w:r>
+      <w:proofErr w:type="spellStart"/>
+      <w:proofErr w:type="gramStart"/>
+      <w:r>
+        <w:t>warranty</w:t>
+      </w:r>
+      <w:proofErr w:type="gramEnd"/>
+      <w:r>
+        <w:t>_date</w:t>
+      </w:r>
+      <w:proofErr w:type="spellEnd"/>
+      <w:r>
+        <w:t>": "2026-06-16 11:09:19+06",</w:t>
       </w:r>
     </w:p>
     <w:p>
@@ -5290,7 +7910,20 @@
     </w:p>
     <w:p>
       <w:r>
-        <w:t>            "created_at": "2026-06-16 11:09:19+06"</w:t>
+        <w:t>            "</w:t>
+      </w:r>
+      <w:proofErr w:type="spellStart"/>
+      <w:proofErr w:type="gramStart"/>
+      <w:r>
+        <w:t>created</w:t>
+      </w:r>
+      <w:proofErr w:type="gramEnd"/>
+      <w:r>
+        <w:t>_at</w:t>
+      </w:r>
+      <w:proofErr w:type="spellEnd"/>
+      <w:r>
+        <w:t>": "2026-06-16 11:09:19+06"</w:t>
       </w:r>
     </w:p>
     <w:p>
@@ -5310,7 +7943,20 @@
     </w:p>
     <w:p>
       <w:r>
-        <w:t>    "page_size": 20,</w:t>
+        <w:t>    "</w:t>
+      </w:r>
+      <w:proofErr w:type="spellStart"/>
+      <w:proofErr w:type="gramStart"/>
+      <w:r>
+        <w:t>page</w:t>
+      </w:r>
+      <w:proofErr w:type="gramEnd"/>
+      <w:r>
+        <w:t>_size</w:t>
+      </w:r>
+      <w:proofErr w:type="spellEnd"/>
+      <w:r>
+        <w:t>": 20,</w:t>
       </w:r>
     </w:p>
     <w:p>
@@ -5343,17 +7989,53 @@
     <w:p/>
     <w:p/>
     <w:p>
-      <w:r>
+      <w:pPr>
+        <w:rPr>
+          <w:b/>
+          <w:bCs/>
+          <w:color w:val="4472C4" w:themeColor="accent1"/>
+        </w:rPr>
+      </w:pPr>
+      <w:r>
+        <w:rPr>
+          <w:b/>
+          <w:bCs/>
+          <w:color w:val="4472C4" w:themeColor="accent1"/>
+        </w:rPr>
         <w:lastRenderedPageBreak/>
         <w:t>2026-14-07</w:t>
       </w:r>
-    </w:p>
+      <w:r>
+        <w:rPr>
+          <w:b/>
+          <w:bCs/>
+          <w:color w:val="4472C4" w:themeColor="accent1"/>
+        </w:rPr>
+        <w:t xml:space="preserve"> for </w:t>
+      </w:r>
+      <w:r>
+        <w:rPr>
+          <w:b/>
+          <w:bCs/>
+          <w:color w:val="4472C4" w:themeColor="accent1"/>
+        </w:rPr>
+        <w:t>Warranty Claims</w:t>
+      </w:r>
+      <w:r>
+        <w:rPr>
+          <w:b/>
+          <w:bCs/>
+          <w:color w:val="4472C4" w:themeColor="accent1"/>
+        </w:rPr>
+        <w:t xml:space="preserve"> Overview</w:t>
+      </w:r>
+    </w:p>
+    <w:p/>
     <w:p>
       <w:pPr>
         <w:rPr>
           <w:b/>
           <w:bCs/>
-          <w:color w:val="4472C4" w:themeColor="accent1"/>
           <w:sz w:val="28"/>
           <w:szCs w:val="28"/>
         </w:rPr>
@@ -5362,74 +8044,249 @@
         <w:rPr>
           <w:b/>
           <w:bCs/>
-          <w:color w:val="4472C4" w:themeColor="accent1"/>
           <w:sz w:val="28"/>
           <w:szCs w:val="28"/>
         </w:rPr>
-        <w:t>Final verified logic</w:t>
-      </w:r>
-      <w:r>
-        <w:rPr>
-          <w:b/>
-          <w:bCs/>
-          <w:color w:val="4472C4" w:themeColor="accent1"/>
+        <w:t xml:space="preserve">Perfect bhai </w:t>
+      </w:r>
+      <w:r>
+        <w:rPr>
+          <w:rFonts w:ascii="Segoe UI Emoji" w:hAnsi="Segoe UI Emoji" w:cs="Segoe UI Emoji"/>
+          <w:b/>
+          <w:bCs/>
           <w:sz w:val="28"/>
           <w:szCs w:val="28"/>
         </w:rPr>
-        <w:t xml:space="preserve"> for Warranty Claimed</w:t>
-      </w:r>
-    </w:p>
-    <w:p>
-      <w:r>
-        <w:t>Claimed   → asset_devices.asset_status = 8 AND row_status = 1</w:t>
-      </w:r>
-    </w:p>
-    <w:p/>
-    <w:p>
-      <w:r>
-        <w:t>To Vendor → device_claims.claim_status = 9</w:t>
-      </w:r>
-    </w:p>
-    <w:p>
-      <w:r>
-        <w:t xml:space="preserve">            current year created_at</w:t>
-      </w:r>
-    </w:p>
-    <w:p>
-      <w:r>
-        <w:t xml:space="preserve">            one row per reference_no_claim</w:t>
-      </w:r>
-    </w:p>
-    <w:p/>
-    <w:p>
-      <w:r>
-        <w:t>Recovered → device_claims.claim_status = 10</w:t>
-      </w:r>
-    </w:p>
-    <w:p>
-      <w:r>
-        <w:t xml:space="preserve">            current year return_date</w:t>
-      </w:r>
-    </w:p>
-    <w:p>
-      <w:r>
-        <w:t xml:space="preserve">            one row per reference_no_claim</w:t>
-      </w:r>
-    </w:p>
-    <w:p/>
-    <w:p>
-      <w:r>
-        <w:t>Expired   → asset_devices.warranty_date in current year</w:t>
-      </w:r>
-    </w:p>
-    <w:p>
-      <w:r>
-        <w:t xml:space="preserve">            warranty_date &lt; current date</w:t>
-      </w:r>
-    </w:p>
-    <w:p>
-      <w:r>
-        <w:t xml:space="preserve">            row_status = 1</w:t>
+        <w:t>✅</w:t>
+      </w:r>
+    </w:p>
+    <w:p>
+      <w:r>
+        <w:t>Now all Warranty Claims status pages are matching correctly:</w:t>
+      </w:r>
+    </w:p>
+    <w:p>
+      <w:r>
+        <w:t>Total     = 227</w:t>
+      </w:r>
+    </w:p>
+    <w:p>
+      <w:r>
+        <w:t>Claimed   = 8</w:t>
+      </w:r>
+    </w:p>
+    <w:p>
+      <w:r>
+        <w:t>To Vendor = 4</w:t>
+      </w:r>
+    </w:p>
+    <w:p>
+      <w:r>
+        <w:t>Recovered = 28</w:t>
+      </w:r>
+    </w:p>
+    <w:p>
+      <w:r>
+        <w:t>Expired   = 187</w:t>
+      </w:r>
+    </w:p>
+    <w:p>
+      <w:r>
+        <w:t>And your latest test confirms:</w:t>
+      </w:r>
+    </w:p>
+    <w:p>
+      <w:r>
+        <w:t>Claimed Postman total = 8</w:t>
+      </w:r>
+    </w:p>
+    <w:p>
+      <w:r>
+        <w:t>Claimed frontend table = 8</w:t>
+      </w:r>
+    </w:p>
+    <w:p>
+      <w:proofErr w:type="gramStart"/>
+      <w:r>
+        <w:t>So</w:t>
+      </w:r>
+      <w:proofErr w:type="gramEnd"/>
+      <w:r>
+        <w:t xml:space="preserve"> module calculation is now consistent.</w:t>
+      </w:r>
+    </w:p>
+    <w:p>
+      <w:r>
+        <w:t>Final verified logic</w:t>
+      </w:r>
+    </w:p>
+    <w:p>
+      <w:r>
+        <w:t xml:space="preserve">Claimed   → </w:t>
+      </w:r>
+      <w:proofErr w:type="spellStart"/>
+      <w:r>
+        <w:t>asset_</w:t>
+      </w:r>
+      <w:proofErr w:type="gramStart"/>
+      <w:r>
+        <w:t>devices.asset</w:t>
+      </w:r>
+      <w:proofErr w:type="gramEnd"/>
+      <w:r>
+        <w:t>_status</w:t>
+      </w:r>
+      <w:proofErr w:type="spellEnd"/>
+      <w:r>
+        <w:t xml:space="preserve"> = 8 AND </w:t>
+      </w:r>
+      <w:proofErr w:type="spellStart"/>
+      <w:r>
+        <w:t>row_status</w:t>
+      </w:r>
+      <w:proofErr w:type="spellEnd"/>
+      <w:r>
+        <w:t xml:space="preserve"> = 1</w:t>
+      </w:r>
+    </w:p>
+    <w:p/>
+    <w:p>
+      <w:r>
+        <w:t xml:space="preserve">To Vendor → </w:t>
+      </w:r>
+      <w:proofErr w:type="spellStart"/>
+      <w:r>
+        <w:t>device_</w:t>
+      </w:r>
+      <w:proofErr w:type="gramStart"/>
+      <w:r>
+        <w:t>claims.claim</w:t>
+      </w:r>
+      <w:proofErr w:type="gramEnd"/>
+      <w:r>
+        <w:t>_status</w:t>
+      </w:r>
+      <w:proofErr w:type="spellEnd"/>
+      <w:r>
+        <w:t xml:space="preserve"> = 9</w:t>
+      </w:r>
+    </w:p>
+    <w:p>
+      <w:r>
+        <w:t xml:space="preserve">            current year </w:t>
+      </w:r>
+      <w:proofErr w:type="spellStart"/>
+      <w:r>
+        <w:t>created_at</w:t>
+      </w:r>
+      <w:proofErr w:type="spellEnd"/>
+    </w:p>
+    <w:p>
+      <w:r>
+        <w:t xml:space="preserve">            one row per </w:t>
+      </w:r>
+      <w:proofErr w:type="spellStart"/>
+      <w:r>
+        <w:t>reference_no_claim</w:t>
+      </w:r>
+      <w:proofErr w:type="spellEnd"/>
+    </w:p>
+    <w:p/>
+    <w:p>
+      <w:r>
+        <w:t xml:space="preserve">Recovered → </w:t>
+      </w:r>
+      <w:proofErr w:type="spellStart"/>
+      <w:r>
+        <w:t>device_</w:t>
+      </w:r>
+      <w:proofErr w:type="gramStart"/>
+      <w:r>
+        <w:t>claims.claim</w:t>
+      </w:r>
+      <w:proofErr w:type="gramEnd"/>
+      <w:r>
+        <w:t>_status</w:t>
+      </w:r>
+      <w:proofErr w:type="spellEnd"/>
+      <w:r>
+        <w:t xml:space="preserve"> = 10</w:t>
+      </w:r>
+    </w:p>
+    <w:p>
+      <w:r>
+        <w:t xml:space="preserve">            current year </w:t>
+      </w:r>
+      <w:proofErr w:type="spellStart"/>
+      <w:r>
+        <w:t>return_date</w:t>
+      </w:r>
+      <w:proofErr w:type="spellEnd"/>
+    </w:p>
+    <w:p>
+      <w:r>
+        <w:t xml:space="preserve">            one row per </w:t>
+      </w:r>
+      <w:proofErr w:type="spellStart"/>
+      <w:r>
+        <w:t>reference_no_claim</w:t>
+      </w:r>
+      <w:proofErr w:type="spellEnd"/>
+    </w:p>
+    <w:p/>
+    <w:p/>
+    <w:p/>
+    <w:p/>
+    <w:p>
+      <w:r>
+        <w:t xml:space="preserve">Expired   → </w:t>
+      </w:r>
+      <w:proofErr w:type="spellStart"/>
+      <w:r>
+        <w:t>asset_</w:t>
+      </w:r>
+      <w:proofErr w:type="gramStart"/>
+      <w:r>
+        <w:t>devices.warranty</w:t>
+      </w:r>
+      <w:proofErr w:type="gramEnd"/>
+      <w:r>
+        <w:t>_date</w:t>
+      </w:r>
+      <w:proofErr w:type="spellEnd"/>
+      <w:r>
+        <w:t xml:space="preserve"> in current year</w:t>
+      </w:r>
+    </w:p>
+    <w:p>
+      <w:r>
+        <w:t xml:space="preserve">            </w:t>
+      </w:r>
+      <w:proofErr w:type="spellStart"/>
+      <w:r>
+        <w:t>warranty_date</w:t>
+      </w:r>
+      <w:proofErr w:type="spellEnd"/>
+      <w:r>
+        <w:t xml:space="preserve"> &lt; current date</w:t>
+      </w:r>
+    </w:p>
+    <w:p>
+      <w:r>
+        <w:t xml:space="preserve">            </w:t>
+      </w:r>
+      <w:proofErr w:type="spellStart"/>
+      <w:r>
+        <w:t>row_status</w:t>
+      </w:r>
+      <w:proofErr w:type="spellEnd"/>
+      <w:r>
+        <w:t xml:space="preserve"> = 1</w:t>
+      </w:r>
+    </w:p>
+    <w:p>
+      <w:r>
+        <w:t>Your next best step: make the View button show a professional detail modal with claim details + history timeline for that reference number.</w:t>
       </w:r>
     </w:p>
     <w:p/>

</xml_diff>

<commit_message>
To Add relationship between device_claims.device_sl_no and asset_devices.device_serial_key and Show Employee Information
</commit_message>
<xml_diff>
--- a/claimed-raised/claimed_closed.docx
+++ b/claimed-raised/claimed_closed.docx
@@ -2,7 +2,6 @@
 <file path=word/document.xml><?xml version="1.0" encoding="utf-8"?>
 <w:document xmlns:wpc="http://schemas.microsoft.com/office/word/2010/wordprocessingCanvas" xmlns:cx="http://schemas.microsoft.com/office/drawing/2014/chartex" xmlns:cx1="http://schemas.microsoft.com/office/drawing/2015/9/8/chartex" xmlns:cx2="http://schemas.microsoft.com/office/drawing/2015/10/21/chartex" xmlns:cx3="http://schemas.microsoft.com/office/drawing/2016/5/9/chartex" xmlns:cx4="http://schemas.microsoft.com/office/drawing/2016/5/10/chartex" xmlns:cx5="http://schemas.microsoft.com/office/drawing/2016/5/11/chartex" xmlns:cx6="http://schemas.microsoft.com/office/drawing/2016/5/12/chartex" xmlns:cx7="http://schemas.microsoft.com/office/drawing/2016/5/13/chartex" xmlns:cx8="http://schemas.microsoft.com/office/drawing/2016/5/14/chartex" xmlns:mc="http://schemas.openxmlformats.org/markup-compatibility/2006" xmlns:aink="http://schemas.microsoft.com/office/drawing/2016/ink" xmlns:am3d="http://schemas.microsoft.com/office/drawing/2017/model3d" xmlns:o="urn:schemas-microsoft-com:office:office" xmlns:oel="http://schemas.microsoft.com/office/2019/extlst" xmlns:r="http://schemas.openxmlformats.org/officeDocument/2006/relationships" xmlns:m="http://schemas.openxmlformats.org/officeDocument/2006/math" xmlns:v="urn:schemas-microsoft-com:vml" xmlns:wp14="http://schemas.microsoft.com/office/word/2010/wordprocessingDrawing" xmlns:wp="http://schemas.openxmlformats.org/drawingml/2006/wordprocessingDrawing" xmlns:w10="urn:schemas-microsoft-com:office:word" xmlns:w="http://schemas.openxmlformats.org/wordprocessingml/2006/main" xmlns:w14="http://schemas.microsoft.com/office/word/2010/wordml" xmlns:w15="http://schemas.microsoft.com/office/word/2012/wordml" xmlns:w16cex="http://schemas.microsoft.com/office/word/2018/wordml/cex" xmlns:w16cid="http://schemas.microsoft.com/office/word/2016/wordml/cid" xmlns:w16="http://schemas.microsoft.com/office/word/2018/wordml" xmlns:w16du="http://schemas.microsoft.com/office/word/2023/wordml/word16du" xmlns:w16sdtdh="http://schemas.microsoft.com/office/word/2020/wordml/sdtdatahash" xmlns:w16sdtfl="http://schemas.microsoft.com/office/word/2024/wordml/sdtformatlock" xmlns:w16se="http://schemas.microsoft.com/office/word/2015/wordml/symex" xmlns:wpg="http://schemas.microsoft.com/office/word/2010/wordprocessingGroup" xmlns:wpi="http://schemas.microsoft.com/office/word/2010/wordprocessingInk" xmlns:wne="http://schemas.microsoft.com/office/word/2006/wordml" xmlns:wps="http://schemas.microsoft.com/office/word/2010/wordprocessingShape" mc:Ignorable="w14 w15 w16se w16cid w16 w16cex w16sdtdh w16sdtfl w16du wp14">
   <w:body>
-    <w:p/>
     <w:p>
       <w:r>
         <w:t xml:space="preserve">SELECT * FROM </w:t>
@@ -40,6 +39,8 @@
         <w:t>) = 2026;</w:t>
       </w:r>
     </w:p>
+    <w:p/>
+    <w:p/>
     <w:p>
       <w:r>
         <w:rPr>
@@ -1753,6 +1754,9 @@
     <w:p/>
     <w:p>
       <w:r>
+        <w:rPr>
+          <w:noProof/>
+        </w:rPr>
         <w:drawing>
           <wp:inline distT="0" distB="0" distL="0" distR="0" wp14:anchorId="3EF19C4C" wp14:editId="522F6EE4">
             <wp:extent cx="5943600" cy="3060065"/>
@@ -2168,6 +2172,9 @@
     <w:p/>
     <w:p>
       <w:r>
+        <w:rPr>
+          <w:noProof/>
+        </w:rPr>
         <w:drawing>
           <wp:inline distT="0" distB="0" distL="0" distR="0" wp14:anchorId="4FE4D480" wp14:editId="0EBD7380">
             <wp:extent cx="5943600" cy="3153410"/>
@@ -2419,6 +2426,9 @@
     <w:p/>
     <w:p>
       <w:r>
+        <w:rPr>
+          <w:noProof/>
+        </w:rPr>
         <w:lastRenderedPageBreak/>
         <w:drawing>
           <wp:inline distT="0" distB="0" distL="0" distR="0" wp14:anchorId="23A9ADD4" wp14:editId="4416E64A">
@@ -2461,6 +2471,9 @@
     <w:p/>
     <w:p>
       <w:r>
+        <w:rPr>
+          <w:noProof/>
+        </w:rPr>
         <w:drawing>
           <wp:inline distT="0" distB="0" distL="0" distR="0" wp14:anchorId="3032ECAB" wp14:editId="1EC7C3F8">
             <wp:extent cx="5943600" cy="3010535"/>
@@ -2504,6 +2517,9 @@
     <w:p/>
     <w:p>
       <w:r>
+        <w:rPr>
+          <w:noProof/>
+        </w:rPr>
         <w:lastRenderedPageBreak/>
         <w:drawing>
           <wp:inline distT="0" distB="0" distL="0" distR="0" wp14:anchorId="3DB8E0B3" wp14:editId="2D559455">
@@ -6951,6 +6967,9 @@
     <w:p/>
     <w:p>
       <w:r>
+        <w:rPr>
+          <w:noProof/>
+        </w:rPr>
         <w:drawing>
           <wp:inline distT="0" distB="0" distL="0" distR="0" wp14:anchorId="6B13B166" wp14:editId="6A46BA85">
             <wp:extent cx="5943600" cy="3178175"/>
@@ -8011,23 +8030,7 @@
           <w:bCs/>
           <w:color w:val="4472C4" w:themeColor="accent1"/>
         </w:rPr>
-        <w:t xml:space="preserve"> for </w:t>
-      </w:r>
-      <w:r>
-        <w:rPr>
-          <w:b/>
-          <w:bCs/>
-          <w:color w:val="4472C4" w:themeColor="accent1"/>
-        </w:rPr>
-        <w:t>Warranty Claims</w:t>
-      </w:r>
-      <w:r>
-        <w:rPr>
-          <w:b/>
-          <w:bCs/>
-          <w:color w:val="4472C4" w:themeColor="accent1"/>
-        </w:rPr>
-        <w:t xml:space="preserve"> Overview</w:t>
+        <w:t xml:space="preserve"> for Warranty Claims Overview</w:t>
       </w:r>
     </w:p>
     <w:p/>
@@ -8903,6 +8906,7 @@
   <w:style w:type="character" w:default="1" w:styleId="DefaultParagraphFont">
     <w:name w:val="Default Paragraph Font"/>
     <w:uiPriority w:val="1"/>
+    <w:semiHidden/>
     <w:unhideWhenUsed/>
   </w:style>
   <w:style w:type="table" w:default="1" w:styleId="TableNormal">

</xml_diff>